<commit_message>
style: optimize invoice layout, text alignment, and center table headers
</commit_message>
<xml_diff>
--- a/templates/hoadon.docx
+++ b/templates/hoadon.docx
@@ -101,7 +101,7 @@
     </w:p>
     <w:p>
       <w:pPr>
-        <w:spacing w:line="276" w:lineRule="auto"/>
+        <w:spacing w:line="240" w:lineRule="auto"/>
         <w:rPr>
           <w:sz w:val="28"/>
           <w:szCs w:val="28"/>
@@ -152,7 +152,7 @@
     </w:p>
     <w:p>
       <w:pPr>
-        <w:spacing w:line="276" w:lineRule="auto"/>
+        <w:spacing w:line="240" w:lineRule="auto"/>
         <w:rPr>
           <w:sz w:val="28"/>
           <w:szCs w:val="28"/>
@@ -185,7 +185,6 @@
           </w:tcPr>
           <w:p>
             <w:pPr>
-              <w:spacing w:line="276" w:lineRule="auto"/>
               <w:jc w:val="center"/>
               <w:rPr>
                 <w:sz w:val="28"/>
@@ -207,7 +206,6 @@
           </w:tcPr>
           <w:p>
             <w:pPr>
-              <w:spacing w:line="276" w:lineRule="auto"/>
               <w:jc w:val="center"/>
               <w:rPr>
                 <w:sz w:val="28"/>
@@ -229,7 +227,6 @@
           </w:tcPr>
           <w:p>
             <w:pPr>
-              <w:spacing w:line="276" w:lineRule="auto"/>
               <w:jc w:val="center"/>
               <w:rPr>
                 <w:sz w:val="28"/>
@@ -251,7 +248,6 @@
           </w:tcPr>
           <w:p>
             <w:pPr>
-              <w:spacing w:line="276" w:lineRule="auto"/>
               <w:jc w:val="center"/>
               <w:rPr>
                 <w:sz w:val="28"/>
@@ -275,7 +271,6 @@
           </w:tcPr>
           <w:p>
             <w:pPr>
-              <w:spacing w:line="276" w:lineRule="auto"/>
               <w:rPr>
                 <w:sz w:val="28"/>
                 <w:szCs w:val="28"/>
@@ -310,7 +305,6 @@
           </w:tcPr>
           <w:p>
             <w:pPr>
-              <w:spacing w:line="276" w:lineRule="auto"/>
               <w:rPr>
                 <w:sz w:val="28"/>
                 <w:szCs w:val="28"/>
@@ -331,7 +325,6 @@
           </w:tcPr>
           <w:p>
             <w:pPr>
-              <w:spacing w:line="276" w:lineRule="auto"/>
               <w:rPr>
                 <w:sz w:val="28"/>
                 <w:szCs w:val="28"/>
@@ -352,7 +345,6 @@
           </w:tcPr>
           <w:p>
             <w:pPr>
-              <w:spacing w:line="276" w:lineRule="auto"/>
               <w:rPr>
                 <w:sz w:val="28"/>
                 <w:szCs w:val="28"/>
@@ -371,7 +363,7 @@
     </w:tbl>
     <w:p>
       <w:pPr>
-        <w:spacing w:line="276" w:lineRule="auto"/>
+        <w:spacing w:line="240" w:lineRule="auto"/>
         <w:rPr>
           <w:sz w:val="28"/>
           <w:szCs w:val="28"/>
@@ -380,7 +372,7 @@
     </w:p>
     <w:p>
       <w:pPr>
-        <w:spacing w:line="276" w:lineRule="auto"/>
+        <w:spacing w:line="240" w:lineRule="auto"/>
         <w:rPr>
           <w:sz w:val="28"/>
           <w:szCs w:val="28"/>
@@ -396,7 +388,7 @@
     </w:p>
     <w:p>
       <w:pPr>
-        <w:spacing w:line="276" w:lineRule="auto"/>
+        <w:spacing w:line="240" w:lineRule="auto"/>
         <w:rPr>
           <w:sz w:val="28"/>
           <w:szCs w:val="28"/>
@@ -412,7 +404,7 @@
     </w:p>
     <w:p>
       <w:pPr>
-        <w:spacing w:line="276" w:lineRule="auto"/>
+        <w:spacing w:line="240" w:lineRule="auto"/>
         <w:rPr>
           <w:sz w:val="28"/>
           <w:szCs w:val="28"/>
@@ -428,7 +420,7 @@
     </w:p>
     <w:p>
       <w:pPr>
-        <w:spacing w:line="276" w:lineRule="auto"/>
+        <w:spacing w:line="240" w:lineRule="auto"/>
         <w:rPr>
           <w:sz w:val="28"/>
           <w:szCs w:val="28"/>
@@ -444,7 +436,7 @@
     </w:p>
     <w:p>
       <w:pPr>
-        <w:spacing w:line="276" w:lineRule="auto"/>
+        <w:spacing w:line="240" w:lineRule="auto"/>
         <w:rPr>
           <w:sz w:val="28"/>
           <w:szCs w:val="28"/>
@@ -457,30 +449,6 @@
         </w:rPr>
         <w:t>Tiền thối lại: {change_amount}</w:t>
       </w:r>
-    </w:p>
-    <w:p>
-      <w:pPr>
-        <w:rPr>
-          <w:sz w:val="28"/>
-          <w:szCs w:val="28"/>
-        </w:rPr>
-      </w:pPr>
-    </w:p>
-    <w:p>
-      <w:pPr>
-        <w:rPr>
-          <w:sz w:val="28"/>
-          <w:szCs w:val="28"/>
-        </w:rPr>
-      </w:pPr>
-    </w:p>
-    <w:p>
-      <w:pPr>
-        <w:rPr>
-          <w:sz w:val="28"/>
-          <w:szCs w:val="28"/>
-        </w:rPr>
-      </w:pPr>
     </w:p>
     <w:p>
       <w:pPr>

</xml_diff>

<commit_message>
style: update hoadon.docx template
</commit_message>
<xml_diff>
--- a/templates/hoadon.docx
+++ b/templates/hoadon.docx
@@ -296,6 +296,20 @@
                 <w:szCs w:val="28"/>
               </w:rPr>
               <w:t>{name}</w:t>
+            </w:r>
+            <w:r>
+              <w:rPr>
+                <w:sz w:val="28"/>
+                <w:szCs w:val="28"/>
+              </w:rPr>
+              <w:br/>
+            </w:r>
+            <w:r>
+              <w:rPr>
+                <w:sz w:val="28"/>
+                <w:szCs w:val="28"/>
+              </w:rPr>
+              <w:t>{notes}</w:t>
             </w:r>
           </w:p>
         </w:tc>
@@ -1089,7 +1103,6 @@
   <w:style w:type="character" w:default="1" w:styleId="DefaultParagraphFont">
     <w:name w:val="Default Paragraph Font"/>
     <w:uiPriority w:val="1"/>
-    <w:semiHidden/>
     <w:unhideWhenUsed/>
   </w:style>
   <w:style w:type="table" w:default="1" w:styleId="TableNormal">

</xml_diff>

<commit_message>
feat: add bank account report, improve reprint QR code, and remove waiter checkout button
</commit_message>
<xml_diff>
--- a/templates/hoadon.docx
+++ b/templates/hoadon.docx
@@ -306,8 +306,35 @@
             </w:r>
             <w:r>
               <w:rPr>
-                <w:sz w:val="28"/>
-                <w:szCs w:val="28"/>
+                <w:i/>
+                <w:iCs/>
+                <w:sz w:val="22"/>
+                <w:szCs w:val="22"/>
+              </w:rPr>
+              <w:t>{options_text}</w:t>
+            </w:r>
+            <w:r>
+              <w:rPr>
+                <w:sz w:val="28"/>
+                <w:szCs w:val="28"/>
+              </w:rPr>
+              <w:br/>
+            </w:r>
+            <w:r>
+              <w:rPr>
+                <w:i/>
+                <w:iCs/>
+                <w:sz w:val="22"/>
+                <w:szCs w:val="22"/>
+              </w:rPr>
+              <w:t xml:space="preserve">Ghi chú: </w:t>
+            </w:r>
+            <w:r>
+              <w:rPr>
+                <w:i/>
+                <w:iCs/>
+                <w:sz w:val="22"/>
+                <w:szCs w:val="22"/>
               </w:rPr>
               <w:t>{notes}</w:t>
             </w:r>
@@ -397,7 +424,21 @@
           <w:sz w:val="28"/>
           <w:szCs w:val="28"/>
         </w:rPr>
-        <w:t>Tổng cộng: {subtotal}</w:t>
+        <w:t xml:space="preserve">Tổng </w:t>
+      </w:r>
+      <w:r>
+        <w:rPr>
+          <w:sz w:val="28"/>
+          <w:szCs w:val="28"/>
+        </w:rPr>
+        <w:t>chưa giảm giá</w:t>
+      </w:r>
+      <w:r>
+        <w:rPr>
+          <w:sz w:val="28"/>
+          <w:szCs w:val="28"/>
+        </w:rPr>
+        <w:t>: {subtotal}</w:t>
       </w:r>
     </w:p>
     <w:p>
@@ -429,7 +470,7 @@
           <w:sz w:val="28"/>
           <w:szCs w:val="28"/>
         </w:rPr>
-        <w:t>Tổng thực thu: {final_total}</w:t>
+        <w:t>Số tiền khách đưa: {received_amount}</w:t>
       </w:r>
     </w:p>
     <w:p>
@@ -445,23 +486,36 @@
           <w:sz w:val="28"/>
           <w:szCs w:val="28"/>
         </w:rPr>
-        <w:t>Số tiền khách đưa: {received_amount}</w:t>
+        <w:t>Tiền thối lại: {change_amount}</w:t>
       </w:r>
     </w:p>
     <w:p>
       <w:pPr>
         <w:spacing w:line="240" w:lineRule="auto"/>
         <w:rPr>
+          <w:b/>
+          <w:bCs/>
           <w:sz w:val="28"/>
           <w:szCs w:val="28"/>
         </w:rPr>
       </w:pPr>
       <w:r>
         <w:rPr>
-          <w:sz w:val="28"/>
-          <w:szCs w:val="28"/>
-        </w:rPr>
-        <w:t>Tiền thối lại: {change_amount}</w:t>
+          <w:b/>
+          <w:bCs/>
+          <w:sz w:val="28"/>
+          <w:szCs w:val="28"/>
+        </w:rPr>
+        <w:t>TỔNG CỘNG</w:t>
+      </w:r>
+      <w:r>
+        <w:rPr>
+          <w:b/>
+          <w:bCs/>
+          <w:sz w:val="28"/>
+          <w:szCs w:val="28"/>
+        </w:rPr>
+        <w:t>: {final_total}</w:t>
       </w:r>
     </w:p>
     <w:p>

</xml_diff>

<commit_message>
feat: update print layout, distribute bill discounts, format item-level discounts, adjust QR position and alignment
</commit_message>
<xml_diff>
--- a/templates/hoadon.docx
+++ b/templates/hoadon.docx
@@ -4,7 +4,7 @@
   <w:body>
     <w:p>
       <w:pPr>
-        <w:spacing w:line="276" w:lineRule="auto"/>
+        <w:spacing w:line="240" w:lineRule="auto"/>
         <w:jc w:val="center"/>
         <w:rPr>
           <w:b/>
@@ -25,7 +25,7 @@
     </w:p>
     <w:p>
       <w:pPr>
-        <w:spacing w:line="276" w:lineRule="auto"/>
+        <w:spacing w:line="240" w:lineRule="auto"/>
         <w:jc w:val="center"/>
         <w:rPr>
           <w:sz w:val="52"/>
@@ -38,11 +38,18 @@
           <w:szCs w:val="52"/>
         </w:rPr>
         <w:t>142 Nguyễn Văn Triết</w:t>
+      </w:r>
+      <w:r>
+        <w:rPr>
+          <w:sz w:val="52"/>
+          <w:szCs w:val="52"/>
+        </w:rPr>
+        <w:t>, Thành phố Hồ Chí Minh</w:t>
       </w:r>
     </w:p>
     <w:p>
       <w:pPr>
-        <w:spacing w:line="276" w:lineRule="auto"/>
+        <w:spacing w:line="240" w:lineRule="auto"/>
         <w:jc w:val="center"/>
         <w:rPr>
           <w:sz w:val="52"/>
@@ -59,15 +66,22 @@
     </w:p>
     <w:p>
       <w:pPr>
-        <w:spacing w:line="276" w:lineRule="auto"/>
+        <w:spacing w:line="240" w:lineRule="auto"/>
         <w:jc w:val="center"/>
+        <w:rPr>
+          <w:sz w:val="52"/>
+          <w:szCs w:val="52"/>
+        </w:rPr>
+      </w:pPr>
+      <w:r>
         <w:rPr>
           <w:b/>
           <w:bCs/>
           <w:sz w:val="52"/>
           <w:szCs w:val="52"/>
         </w:rPr>
-      </w:pPr>
+        <w:t>HOÁ ĐƠN</w:t>
+      </w:r>
       <w:r>
         <w:rPr>
           <w:b/>
@@ -75,33 +89,29 @@
           <w:sz w:val="52"/>
           <w:szCs w:val="52"/>
         </w:rPr>
-        <w:t>HOÁ ĐƠN</w:t>
+        <w:t xml:space="preserve"> THANH TOÁN</w:t>
       </w:r>
-    </w:p>
-    <w:p>
-      <w:pPr>
-        <w:spacing w:line="276" w:lineRule="auto"/>
-        <w:jc w:val="center"/>
+      <w:r>
         <w:rPr>
           <w:b/>
           <w:bCs/>
-          <w:sz w:val="32"/>
-          <w:szCs w:val="32"/>
-        </w:rPr>
-      </w:pPr>
+          <w:sz w:val="52"/>
+          <w:szCs w:val="52"/>
+        </w:rPr>
+        <w:br/>
+      </w:r>
       <w:r>
         <w:rPr>
-          <w:b/>
-          <w:bCs/>
-          <w:sz w:val="32"/>
-          <w:szCs w:val="32"/>
-        </w:rPr>
-        <w:t>{table_name}</w:t>
+          <w:sz w:val="52"/>
+          <w:szCs w:val="52"/>
+        </w:rPr>
+        <w:t>Số: 100006435</w:t>
       </w:r>
     </w:p>
     <w:p>
       <w:pPr>
         <w:spacing w:line="240" w:lineRule="auto"/>
+        <w:jc w:val="center"/>
         <w:rPr>
           <w:sz w:val="28"/>
           <w:szCs w:val="28"/>
@@ -109,79 +119,206 @@
       </w:pPr>
       <w:r>
         <w:rPr>
-          <w:sz w:val="28"/>
-          <w:szCs w:val="28"/>
-        </w:rPr>
-        <w:t>Giờ vào: {order_time}</w:t>
+          <w:sz w:val="52"/>
+          <w:szCs w:val="52"/>
+        </w:rPr>
+        <w:t>----------------------------------------------------</w:t>
       </w:r>
       <w:r>
         <w:rPr>
-          <w:sz w:val="28"/>
-          <w:szCs w:val="28"/>
+          <w:b/>
+          <w:bCs/>
+          <w:sz w:val="32"/>
+          <w:szCs w:val="32"/>
         </w:rPr>
         <w:tab/>
-      </w:r>
-      <w:r>
-        <w:rPr>
-          <w:sz w:val="28"/>
-          <w:szCs w:val="28"/>
-        </w:rPr>
-        <w:tab/>
-      </w:r>
-      <w:r>
-        <w:rPr>
-          <w:sz w:val="28"/>
-          <w:szCs w:val="28"/>
-        </w:rPr>
-        <w:tab/>
-      </w:r>
-      <w:r>
-        <w:rPr>
-          <w:sz w:val="28"/>
-          <w:szCs w:val="28"/>
-        </w:rPr>
-        <w:tab/>
-      </w:r>
-      <w:r>
-        <w:rPr>
-          <w:sz w:val="28"/>
-          <w:szCs w:val="28"/>
-        </w:rPr>
-        <w:tab/>
-      </w:r>
-    </w:p>
-    <w:p>
-      <w:pPr>
-        <w:spacing w:line="240" w:lineRule="auto"/>
-        <w:rPr>
-          <w:sz w:val="28"/>
-          <w:szCs w:val="28"/>
-        </w:rPr>
-      </w:pPr>
-      <w:r>
-        <w:rPr>
-          <w:sz w:val="28"/>
-          <w:szCs w:val="28"/>
-        </w:rPr>
-        <w:t>Giờ ra: {checkout_time}</w:t>
       </w:r>
     </w:p>
     <w:tbl>
       <w:tblPr>
         <w:tblStyle w:val="TableGrid"/>
-        <w:tblW w:w="0" w:type="auto"/>
+        <w:tblW w:w="9923" w:type="dxa"/>
+        <w:tblBorders>
+          <w:top w:val="none" w:sz="0" w:space="0" w:color="auto"/>
+          <w:left w:val="none" w:sz="0" w:space="0" w:color="auto"/>
+          <w:bottom w:val="none" w:sz="0" w:space="0" w:color="auto"/>
+          <w:right w:val="none" w:sz="0" w:space="0" w:color="auto"/>
+          <w:insideH w:val="none" w:sz="0" w:space="0" w:color="auto"/>
+          <w:insideV w:val="none" w:sz="0" w:space="0" w:color="auto"/>
+        </w:tblBorders>
         <w:tblLook w:val="04A0" w:firstRow="1" w:lastRow="0" w:firstColumn="1" w:lastColumn="0" w:noHBand="0" w:noVBand="1"/>
       </w:tblPr>
       <w:tblGrid>
-        <w:gridCol w:w="2337"/>
-        <w:gridCol w:w="2337"/>
-        <w:gridCol w:w="2338"/>
-        <w:gridCol w:w="2338"/>
+        <w:gridCol w:w="4961"/>
+        <w:gridCol w:w="4962"/>
       </w:tblGrid>
       <w:tr>
+        <w:trPr>
+          <w:trHeight w:val="418"/>
+        </w:trPr>
         <w:tc>
           <w:tcPr>
-            <w:tcW w:w="2337" w:type="dxa"/>
+            <w:tcW w:w="4944" w:type="dxa"/>
+            <w:vAlign w:val="center"/>
+          </w:tcPr>
+          <w:p>
+            <w:pPr>
+              <w:rPr>
+                <w:sz w:val="28"/>
+                <w:szCs w:val="28"/>
+              </w:rPr>
+            </w:pPr>
+            <w:r>
+              <w:rPr>
+                <w:b/>
+                <w:bCs/>
+                <w:sz w:val="32"/>
+                <w:szCs w:val="32"/>
+              </w:rPr>
+              <w:t xml:space="preserve">Tại bàn: </w:t>
+            </w:r>
+            <w:r>
+              <w:rPr>
+                <w:b/>
+                <w:bCs/>
+                <w:sz w:val="32"/>
+                <w:szCs w:val="32"/>
+              </w:rPr>
+              <w:tab/>
+            </w:r>
+          </w:p>
+        </w:tc>
+        <w:tc>
+          <w:tcPr>
+            <w:tcW w:w="4945" w:type="dxa"/>
+            <w:vAlign w:val="center"/>
+          </w:tcPr>
+          <w:p>
+            <w:pPr>
+              <w:jc w:val="right"/>
+              <w:rPr>
+                <w:sz w:val="28"/>
+                <w:szCs w:val="28"/>
+              </w:rPr>
+            </w:pPr>
+            <w:r>
+              <w:rPr>
+                <w:b/>
+                <w:bCs/>
+                <w:sz w:val="32"/>
+                <w:szCs w:val="32"/>
+              </w:rPr>
+              <w:t>{table_name}</w:t>
+            </w:r>
+          </w:p>
+        </w:tc>
+      </w:tr>
+      <w:tr>
+        <w:trPr>
+          <w:trHeight w:val="269"/>
+        </w:trPr>
+        <w:tc>
+          <w:tcPr>
+            <w:tcW w:w="4944" w:type="dxa"/>
+            <w:vAlign w:val="center"/>
+          </w:tcPr>
+          <w:p>
+            <w:pPr>
+              <w:rPr>
+                <w:sz w:val="28"/>
+                <w:szCs w:val="28"/>
+              </w:rPr>
+            </w:pPr>
+            <w:r>
+              <w:rPr>
+                <w:sz w:val="28"/>
+                <w:szCs w:val="28"/>
+              </w:rPr>
+              <w:t>Giờ vào: {order_time}</w:t>
+            </w:r>
+            <w:r>
+              <w:rPr>
+                <w:sz w:val="28"/>
+                <w:szCs w:val="28"/>
+              </w:rPr>
+              <w:tab/>
+            </w:r>
+          </w:p>
+        </w:tc>
+        <w:tc>
+          <w:tcPr>
+            <w:tcW w:w="4945" w:type="dxa"/>
+            <w:vAlign w:val="center"/>
+          </w:tcPr>
+          <w:p>
+            <w:pPr>
+              <w:jc w:val="right"/>
+              <w:rPr>
+                <w:sz w:val="28"/>
+                <w:szCs w:val="28"/>
+              </w:rPr>
+            </w:pPr>
+            <w:r>
+              <w:rPr>
+                <w:sz w:val="28"/>
+                <w:szCs w:val="28"/>
+              </w:rPr>
+              <w:t xml:space="preserve">Giờ in: </w:t>
+            </w:r>
+            <w:r>
+              <w:rPr>
+                <w:sz w:val="28"/>
+                <w:szCs w:val="28"/>
+              </w:rPr>
+              <w:t>{checkout_time}</w:t>
+            </w:r>
+          </w:p>
+        </w:tc>
+      </w:tr>
+    </w:tbl>
+    <w:tbl>
+      <w:tblPr>
+        <w:tblStyle w:val="TableGrid"/>
+        <w:tblpPr w:leftFromText="180" w:rightFromText="180" w:vertAnchor="text" w:horzAnchor="margin" w:tblpY="280"/>
+        <w:tblW w:w="9923" w:type="dxa"/>
+        <w:tblLook w:val="04A0" w:firstRow="1" w:lastRow="0" w:firstColumn="1" w:lastColumn="0" w:noHBand="0" w:noVBand="1"/>
+      </w:tblPr>
+      <w:tblGrid>
+        <w:gridCol w:w="4957"/>
+        <w:gridCol w:w="2693"/>
+        <w:gridCol w:w="2273"/>
+      </w:tblGrid>
+      <w:tr>
+        <w:trPr>
+          <w:trHeight w:val="371"/>
+        </w:trPr>
+        <w:tc>
+          <w:tcPr>
+            <w:tcW w:w="4957" w:type="dxa"/>
+            <w:vAlign w:val="center"/>
+          </w:tcPr>
+          <w:p>
+            <w:pPr>
+              <w:rPr>
+                <w:sz w:val="28"/>
+                <w:szCs w:val="28"/>
+              </w:rPr>
+            </w:pPr>
+            <w:r>
+              <w:rPr>
+                <w:b/>
+                <w:bCs/>
+                <w:sz w:val="28"/>
+                <w:szCs w:val="28"/>
+              </w:rPr>
+              <w:t>Mặt hàng</w:t>
+            </w:r>
+          </w:p>
+        </w:tc>
+        <w:tc>
+          <w:tcPr>
+            <w:tcW w:w="2693" w:type="dxa"/>
+            <w:vAlign w:val="center"/>
           </w:tcPr>
           <w:p>
             <w:pPr>
@@ -196,13 +333,115 @@
                 <w:sz w:val="28"/>
                 <w:szCs w:val="28"/>
               </w:rPr>
-              <w:t>Mặt hàng</w:t>
+              <w:t>SL</w:t>
+            </w:r>
+            <w:r>
+              <w:rPr>
+                <w:sz w:val="28"/>
+                <w:szCs w:val="28"/>
+              </w:rPr>
+              <w:t>/TL</w:t>
             </w:r>
           </w:p>
         </w:tc>
         <w:tc>
           <w:tcPr>
-            <w:tcW w:w="2337" w:type="dxa"/>
+            <w:tcW w:w="2273" w:type="dxa"/>
+            <w:vAlign w:val="center"/>
+          </w:tcPr>
+          <w:p>
+            <w:pPr>
+              <w:jc w:val="right"/>
+              <w:rPr>
+                <w:sz w:val="28"/>
+                <w:szCs w:val="28"/>
+              </w:rPr>
+            </w:pPr>
+            <w:r>
+              <w:rPr>
+                <w:sz w:val="28"/>
+                <w:szCs w:val="28"/>
+              </w:rPr>
+              <w:t>T.Tiền</w:t>
+            </w:r>
+          </w:p>
+        </w:tc>
+      </w:tr>
+      <w:tr>
+        <w:trPr>
+          <w:trHeight w:val="969"/>
+        </w:trPr>
+        <w:tc>
+          <w:tcPr>
+            <w:tcW w:w="4957" w:type="dxa"/>
+            <w:vAlign w:val="center"/>
+          </w:tcPr>
+          <w:p>
+            <w:pPr>
+              <w:rPr>
+                <w:sz w:val="28"/>
+                <w:szCs w:val="28"/>
+              </w:rPr>
+            </w:pPr>
+            <w:r>
+              <w:rPr>
+                <w:sz w:val="28"/>
+                <w:szCs w:val="28"/>
+              </w:rPr>
+              <w:t>{#items</w:t>
+            </w:r>
+            <w:r>
+              <w:rPr>
+                <w:sz w:val="28"/>
+                <w:szCs w:val="28"/>
+              </w:rPr>
+              <w:t xml:space="preserve">} </w:t>
+            </w:r>
+            <w:r>
+              <w:rPr>
+                <w:sz w:val="28"/>
+                <w:szCs w:val="28"/>
+              </w:rPr>
+              <w:t>{name}</w:t>
+            </w:r>
+            <w:r>
+              <w:rPr>
+                <w:sz w:val="28"/>
+                <w:szCs w:val="28"/>
+              </w:rPr>
+              <w:br/>
+            </w:r>
+            <w:r>
+              <w:rPr>
+                <w:i/>
+                <w:iCs/>
+                <w:sz w:val="22"/>
+                <w:szCs w:val="22"/>
+              </w:rPr>
+              <w:t>{options_text}</w:t>
+            </w:r>
+            <w:r>
+              <w:rPr>
+                <w:sz w:val="28"/>
+                <w:szCs w:val="28"/>
+              </w:rPr>
+              <w:br/>
+            </w:r>
+            <w:r>
+              <w:rPr>
+                <w:i/>
+                <w:iCs/>
+                <w:sz w:val="22"/>
+                <w:szCs w:val="22"/>
+              </w:rPr>
+              <w:t>{notes}</w:t>
+            </w:r>
+          </w:p>
+        </w:tc>
+        <w:tc>
+          <w:tcPr>
+            <w:tcW w:w="2693" w:type="dxa"/>
+            <w:vAlign w:val="center"/>
           </w:tcPr>
           <w:p>
             <w:pPr>
@@ -217,175 +456,18 @@
                 <w:sz w:val="28"/>
                 <w:szCs w:val="28"/>
               </w:rPr>
-              <w:t>Đơn giá</w:t>
+              <w:t>{quantity}</w:t>
             </w:r>
           </w:p>
         </w:tc>
         <w:tc>
           <w:tcPr>
-            <w:tcW w:w="2338" w:type="dxa"/>
+            <w:tcW w:w="2273" w:type="dxa"/>
+            <w:vAlign w:val="center"/>
           </w:tcPr>
           <w:p>
             <w:pPr>
-              <w:jc w:val="center"/>
-              <w:rPr>
-                <w:sz w:val="28"/>
-                <w:szCs w:val="28"/>
-              </w:rPr>
-            </w:pPr>
-            <w:r>
-              <w:rPr>
-                <w:sz w:val="28"/>
-                <w:szCs w:val="28"/>
-              </w:rPr>
-              <w:t>SL</w:t>
-            </w:r>
-          </w:p>
-        </w:tc>
-        <w:tc>
-          <w:tcPr>
-            <w:tcW w:w="2338" w:type="dxa"/>
-          </w:tcPr>
-          <w:p>
-            <w:pPr>
-              <w:jc w:val="center"/>
-              <w:rPr>
-                <w:sz w:val="28"/>
-                <w:szCs w:val="28"/>
-              </w:rPr>
-            </w:pPr>
-            <w:r>
-              <w:rPr>
-                <w:sz w:val="28"/>
-                <w:szCs w:val="28"/>
-              </w:rPr>
-              <w:t>Tổng</w:t>
-            </w:r>
-          </w:p>
-        </w:tc>
-      </w:tr>
-      <w:tr>
-        <w:tc>
-          <w:tcPr>
-            <w:tcW w:w="2337" w:type="dxa"/>
-          </w:tcPr>
-          <w:p>
-            <w:pPr>
-              <w:rPr>
-                <w:sz w:val="28"/>
-                <w:szCs w:val="28"/>
-              </w:rPr>
-            </w:pPr>
-            <w:r>
-              <w:rPr>
-                <w:sz w:val="28"/>
-                <w:szCs w:val="28"/>
-              </w:rPr>
-              <w:t>{#items</w:t>
-            </w:r>
-            <w:r>
-              <w:rPr>
-                <w:sz w:val="28"/>
-                <w:szCs w:val="28"/>
-              </w:rPr>
-              <w:t xml:space="preserve">} </w:t>
-            </w:r>
-            <w:r>
-              <w:rPr>
-                <w:sz w:val="28"/>
-                <w:szCs w:val="28"/>
-              </w:rPr>
-              <w:t>{name}</w:t>
-            </w:r>
-            <w:r>
-              <w:rPr>
-                <w:sz w:val="28"/>
-                <w:szCs w:val="28"/>
-              </w:rPr>
-              <w:br/>
-            </w:r>
-            <w:r>
-              <w:rPr>
-                <w:i/>
-                <w:iCs/>
-                <w:sz w:val="22"/>
-                <w:szCs w:val="22"/>
-              </w:rPr>
-              <w:t>{options_text}</w:t>
-            </w:r>
-            <w:r>
-              <w:rPr>
-                <w:sz w:val="28"/>
-                <w:szCs w:val="28"/>
-              </w:rPr>
-              <w:br/>
-            </w:r>
-            <w:r>
-              <w:rPr>
-                <w:i/>
-                <w:iCs/>
-                <w:sz w:val="22"/>
-                <w:szCs w:val="22"/>
-              </w:rPr>
-              <w:t xml:space="preserve">Ghi chú: </w:t>
-            </w:r>
-            <w:r>
-              <w:rPr>
-                <w:i/>
-                <w:iCs/>
-                <w:sz w:val="22"/>
-                <w:szCs w:val="22"/>
-              </w:rPr>
-              <w:t>{notes}</w:t>
-            </w:r>
-          </w:p>
-        </w:tc>
-        <w:tc>
-          <w:tcPr>
-            <w:tcW w:w="2337" w:type="dxa"/>
-          </w:tcPr>
-          <w:p>
-            <w:pPr>
-              <w:rPr>
-                <w:sz w:val="28"/>
-                <w:szCs w:val="28"/>
-              </w:rPr>
-            </w:pPr>
-            <w:r>
-              <w:rPr>
-                <w:sz w:val="28"/>
-                <w:szCs w:val="28"/>
-              </w:rPr>
-              <w:t>{price}</w:t>
-            </w:r>
-          </w:p>
-        </w:tc>
-        <w:tc>
-          <w:tcPr>
-            <w:tcW w:w="2338" w:type="dxa"/>
-          </w:tcPr>
-          <w:p>
-            <w:pPr>
-              <w:rPr>
-                <w:sz w:val="28"/>
-                <w:szCs w:val="28"/>
-              </w:rPr>
-            </w:pPr>
-            <w:r>
-              <w:rPr>
-                <w:sz w:val="28"/>
-                <w:szCs w:val="28"/>
-              </w:rPr>
-              <w:t>{quantity}</w:t>
-            </w:r>
-          </w:p>
-        </w:tc>
-        <w:tc>
-          <w:tcPr>
-            <w:tcW w:w="2338" w:type="dxa"/>
-          </w:tcPr>
-          <w:p>
-            <w:pPr>
+              <w:jc w:val="right"/>
               <w:rPr>
                 <w:sz w:val="28"/>
                 <w:szCs w:val="28"/>
@@ -411,6 +493,149 @@
         </w:rPr>
       </w:pPr>
     </w:p>
+    <w:tbl>
+      <w:tblPr>
+        <w:tblStyle w:val="TableGrid"/>
+        <w:tblW w:w="9925" w:type="dxa"/>
+        <w:tblBorders>
+          <w:top w:val="none" w:sz="0" w:space="0" w:color="auto"/>
+          <w:left w:val="none" w:sz="0" w:space="0" w:color="auto"/>
+          <w:bottom w:val="none" w:sz="0" w:space="0" w:color="auto"/>
+          <w:right w:val="none" w:sz="0" w:space="0" w:color="auto"/>
+          <w:insideH w:val="none" w:sz="0" w:space="0" w:color="auto"/>
+          <w:insideV w:val="none" w:sz="0" w:space="0" w:color="auto"/>
+        </w:tblBorders>
+        <w:tblLook w:val="04A0" w:firstRow="1" w:lastRow="0" w:firstColumn="1" w:lastColumn="0" w:noHBand="0" w:noVBand="1"/>
+      </w:tblPr>
+      <w:tblGrid>
+        <w:gridCol w:w="5262"/>
+        <w:gridCol w:w="4663"/>
+      </w:tblGrid>
+      <w:tr>
+        <w:trPr>
+          <w:trHeight w:val="393"/>
+        </w:trPr>
+        <w:tc>
+          <w:tcPr>
+            <w:tcW w:w="5262" w:type="dxa"/>
+          </w:tcPr>
+          <w:p>
+            <w:pPr>
+              <w:rPr>
+                <w:sz w:val="28"/>
+                <w:szCs w:val="28"/>
+              </w:rPr>
+            </w:pPr>
+            <w:r>
+              <w:rPr>
+                <w:sz w:val="28"/>
+                <w:szCs w:val="28"/>
+              </w:rPr>
+              <w:t>Tiền hàng</w:t>
+            </w:r>
+            <w:r>
+              <w:rPr>
+                <w:sz w:val="28"/>
+                <w:szCs w:val="28"/>
+              </w:rPr>
+              <w:t xml:space="preserve"> </w:t>
+            </w:r>
+            <w:r>
+              <w:rPr>
+                <w:sz w:val="28"/>
+                <w:szCs w:val="28"/>
+              </w:rPr>
+              <w:t>({total_items})</w:t>
+            </w:r>
+          </w:p>
+        </w:tc>
+        <w:tc>
+          <w:tcPr>
+            <w:tcW w:w="4663" w:type="dxa"/>
+          </w:tcPr>
+          <w:p>
+            <w:pPr>
+              <w:jc w:val="right"/>
+              <w:rPr>
+                <w:sz w:val="28"/>
+                <w:szCs w:val="28"/>
+              </w:rPr>
+            </w:pPr>
+            <w:r>
+              <w:rPr>
+                <w:b/>
+                <w:bCs/>
+                <w:sz w:val="28"/>
+                <w:szCs w:val="28"/>
+              </w:rPr>
+              <w:t xml:space="preserve"> {final_total}</w:t>
+            </w:r>
+          </w:p>
+        </w:tc>
+      </w:tr>
+      <w:tr>
+        <w:trPr>
+          <w:trHeight w:val="407"/>
+        </w:trPr>
+        <w:tc>
+          <w:tcPr>
+            <w:tcW w:w="5262" w:type="dxa"/>
+          </w:tcPr>
+          <w:p>
+            <w:pPr>
+              <w:rPr>
+                <w:b/>
+                <w:bCs/>
+                <w:sz w:val="28"/>
+                <w:szCs w:val="28"/>
+              </w:rPr>
+            </w:pPr>
+            <w:r>
+              <w:rPr>
+                <w:b/>
+                <w:bCs/>
+                <w:sz w:val="28"/>
+                <w:szCs w:val="28"/>
+              </w:rPr>
+              <w:t>THANH TOÁN</w:t>
+            </w:r>
+          </w:p>
+        </w:tc>
+        <w:tc>
+          <w:tcPr>
+            <w:tcW w:w="4663" w:type="dxa"/>
+          </w:tcPr>
+          <w:p>
+            <w:pPr>
+              <w:jc w:val="right"/>
+              <w:rPr>
+                <w:sz w:val="28"/>
+                <w:szCs w:val="28"/>
+              </w:rPr>
+            </w:pPr>
+            <w:r>
+              <w:rPr>
+                <w:b/>
+                <w:bCs/>
+                <w:sz w:val="28"/>
+                <w:szCs w:val="28"/>
+              </w:rPr>
+              <w:t>{final_total}</w:t>
+            </w:r>
+            <w:r>
+              <w:rPr>
+                <w:b/>
+                <w:bCs/>
+                <w:sz w:val="28"/>
+                <w:szCs w:val="28"/>
+                <w:u w:val="single"/>
+              </w:rPr>
+              <w:t>đ</w:t>
+            </w:r>
+          </w:p>
+        </w:tc>
+      </w:tr>
+    </w:tbl>
     <w:p>
       <w:pPr>
         <w:spacing w:line="240" w:lineRule="auto"/>
@@ -419,103 +644,39 @@
           <w:szCs w:val="28"/>
         </w:rPr>
       </w:pPr>
-      <w:r>
-        <w:rPr>
-          <w:sz w:val="28"/>
-          <w:szCs w:val="28"/>
-        </w:rPr>
-        <w:t xml:space="preserve">Tổng </w:t>
-      </w:r>
-      <w:r>
-        <w:rPr>
-          <w:sz w:val="28"/>
-          <w:szCs w:val="28"/>
-        </w:rPr>
-        <w:t>chưa giảm giá</w:t>
-      </w:r>
-      <w:r>
-        <w:rPr>
-          <w:sz w:val="28"/>
-          <w:szCs w:val="28"/>
-        </w:rPr>
-        <w:t>: {subtotal}</w:t>
-      </w:r>
     </w:p>
     <w:p>
       <w:pPr>
-        <w:spacing w:line="240" w:lineRule="auto"/>
-        <w:rPr>
-          <w:sz w:val="28"/>
-          <w:szCs w:val="28"/>
+        <w:tabs>
+          <w:tab w:val="left" w:pos="2640"/>
+        </w:tabs>
+        <w:spacing w:after="0" w:line="240" w:lineRule="auto"/>
+        <w:jc w:val="center"/>
+        <w:rPr>
+          <w:sz w:val="36"/>
+          <w:szCs w:val="36"/>
         </w:rPr>
       </w:pPr>
       <w:r>
         <w:rPr>
-          <w:sz w:val="28"/>
-          <w:szCs w:val="28"/>
-        </w:rPr>
-        <w:t>Giảm giá: {discount}</w:t>
-      </w:r>
-    </w:p>
-    <w:p>
-      <w:pPr>
-        <w:spacing w:line="240" w:lineRule="auto"/>
-        <w:rPr>
-          <w:sz w:val="28"/>
-          <w:szCs w:val="28"/>
-        </w:rPr>
-      </w:pPr>
-      <w:r>
-        <w:rPr>
-          <w:sz w:val="28"/>
-          <w:szCs w:val="28"/>
-        </w:rPr>
-        <w:t>Số tiền khách đưa: {received_amount}</w:t>
-      </w:r>
-    </w:p>
-    <w:p>
-      <w:pPr>
-        <w:spacing w:line="240" w:lineRule="auto"/>
-        <w:rPr>
-          <w:sz w:val="28"/>
-          <w:szCs w:val="28"/>
-        </w:rPr>
-      </w:pPr>
-      <w:r>
-        <w:rPr>
-          <w:sz w:val="28"/>
-          <w:szCs w:val="28"/>
-        </w:rPr>
-        <w:t>Tiền thối lại: {change_amount}</w:t>
-      </w:r>
-    </w:p>
-    <w:p>
-      <w:pPr>
-        <w:spacing w:line="240" w:lineRule="auto"/>
-        <w:rPr>
-          <w:b/>
-          <w:bCs/>
-          <w:sz w:val="28"/>
-          <w:szCs w:val="28"/>
-        </w:rPr>
-      </w:pPr>
-      <w:r>
-        <w:rPr>
-          <w:b/>
-          <w:bCs/>
-          <w:sz w:val="28"/>
-          <w:szCs w:val="28"/>
-        </w:rPr>
-        <w:t>TỔNG CỘNG</w:t>
+          <w:sz w:val="36"/>
+          <w:szCs w:val="36"/>
+        </w:rPr>
+        <w:t xml:space="preserve">Tấm xin cảm ơn </w:t>
       </w:r>
       <w:r>
         <w:rPr>
-          <w:b/>
-          <w:bCs/>
-          <w:sz w:val="28"/>
-          <w:szCs w:val="28"/>
-        </w:rPr>
-        <w:t>: {final_total}</w:t>
+          <w:sz w:val="36"/>
+          <w:szCs w:val="36"/>
+        </w:rPr>
+        <w:t>và hẹn gặp lại</w:t>
+      </w:r>
+      <w:r>
+        <w:rPr>
+          <w:sz w:val="36"/>
+          <w:szCs w:val="36"/>
+        </w:rPr>
+        <w:t>!</w:t>
       </w:r>
     </w:p>
     <w:p>
@@ -523,25 +684,23 @@
         <w:tabs>
           <w:tab w:val="left" w:pos="2640"/>
         </w:tabs>
+        <w:spacing w:after="0" w:line="240" w:lineRule="auto"/>
         <w:jc w:val="center"/>
         <w:rPr>
+          <w:b/>
+          <w:bCs/>
           <w:sz w:val="36"/>
           <w:szCs w:val="36"/>
         </w:rPr>
       </w:pPr>
       <w:r>
         <w:rPr>
+          <w:b/>
+          <w:bCs/>
           <w:sz w:val="36"/>
           <w:szCs w:val="36"/>
         </w:rPr>
-        <w:t>Tấm xin cảm ơn sự ủng hộ của cả nhà</w:t>
-      </w:r>
-      <w:r>
-        <w:rPr>
-          <w:sz w:val="36"/>
-          <w:szCs w:val="36"/>
-        </w:rPr>
-        <w:t>!</w:t>
+        <w:t>Wifi: Tam xua – Pass: xincamon</w:t>
       </w:r>
     </w:p>
     <w:sectPr>

</xml_diff>

<commit_message>
style: increase overall printed receipt font sizes
</commit_message>
<xml_diff>
--- a/templates/hoadon.docx
+++ b/templates/hoadon.docx
@@ -102,10 +102,19 @@
       </w:r>
       <w:r>
         <w:rPr>
-          <w:sz w:val="52"/>
-          <w:szCs w:val="52"/>
-        </w:rPr>
-        <w:t>Số: 100006435</w:t>
+          <w:sz w:val="40"/>
+          <w:szCs w:val="40"/>
+        </w:rPr>
+        <w:t xml:space="preserve">Số: </w:t>
+      </w:r>
+      <w:r>
+        <w:rPr>
+          <w:b/>
+          <w:bCs/>
+          <w:sz w:val="40"/>
+          <w:szCs w:val="40"/>
+        </w:rPr>
+        <w:t>100006435</w:t>
       </w:r>
     </w:p>
     <w:p>
@@ -113,14 +122,14 @@
         <w:spacing w:line="240" w:lineRule="auto"/>
         <w:jc w:val="center"/>
         <w:rPr>
-          <w:sz w:val="28"/>
-          <w:szCs w:val="28"/>
+          <w:sz w:val="40"/>
+          <w:szCs w:val="40"/>
         </w:rPr>
       </w:pPr>
       <w:r>
         <w:rPr>
-          <w:sz w:val="52"/>
-          <w:szCs w:val="52"/>
+          <w:sz w:val="40"/>
+          <w:szCs w:val="40"/>
         </w:rPr>
         <w:t>----------------------------------------------------</w:t>
       </w:r>
@@ -128,8 +137,8 @@
         <w:rPr>
           <w:b/>
           <w:bCs/>
-          <w:sz w:val="32"/>
-          <w:szCs w:val="32"/>
+          <w:sz w:val="40"/>
+          <w:szCs w:val="40"/>
         </w:rPr>
         <w:tab/>
       </w:r>
@@ -164,16 +173,16 @@
           <w:p>
             <w:pPr>
               <w:rPr>
-                <w:sz w:val="28"/>
-                <w:szCs w:val="28"/>
+                <w:sz w:val="40"/>
+                <w:szCs w:val="40"/>
               </w:rPr>
             </w:pPr>
             <w:r>
               <w:rPr>
                 <w:b/>
                 <w:bCs/>
-                <w:sz w:val="32"/>
-                <w:szCs w:val="32"/>
+                <w:sz w:val="40"/>
+                <w:szCs w:val="40"/>
               </w:rPr>
               <w:t xml:space="preserve">Tại bàn: </w:t>
             </w:r>
@@ -181,8 +190,8 @@
               <w:rPr>
                 <w:b/>
                 <w:bCs/>
-                <w:sz w:val="32"/>
-                <w:szCs w:val="32"/>
+                <w:sz w:val="40"/>
+                <w:szCs w:val="40"/>
               </w:rPr>
               <w:tab/>
             </w:r>
@@ -197,16 +206,16 @@
             <w:pPr>
               <w:jc w:val="right"/>
               <w:rPr>
-                <w:sz w:val="28"/>
-                <w:szCs w:val="28"/>
+                <w:sz w:val="40"/>
+                <w:szCs w:val="40"/>
               </w:rPr>
             </w:pPr>
             <w:r>
               <w:rPr>
                 <w:b/>
                 <w:bCs/>
-                <w:sz w:val="32"/>
-                <w:szCs w:val="32"/>
+                <w:sz w:val="40"/>
+                <w:szCs w:val="40"/>
               </w:rPr>
               <w:t>{table_name}</w:t>
             </w:r>
@@ -225,21 +234,21 @@
           <w:p>
             <w:pPr>
               <w:rPr>
-                <w:sz w:val="28"/>
-                <w:szCs w:val="28"/>
+                <w:sz w:val="40"/>
+                <w:szCs w:val="40"/>
               </w:rPr>
             </w:pPr>
             <w:r>
               <w:rPr>
-                <w:sz w:val="28"/>
-                <w:szCs w:val="28"/>
+                <w:sz w:val="40"/>
+                <w:szCs w:val="40"/>
               </w:rPr>
               <w:t>Giờ vào: {order_time}</w:t>
             </w:r>
             <w:r>
               <w:rPr>
-                <w:sz w:val="28"/>
-                <w:szCs w:val="28"/>
+                <w:sz w:val="40"/>
+                <w:szCs w:val="40"/>
               </w:rPr>
               <w:tab/>
             </w:r>
@@ -254,23 +263,16 @@
             <w:pPr>
               <w:jc w:val="right"/>
               <w:rPr>
-                <w:sz w:val="28"/>
-                <w:szCs w:val="28"/>
+                <w:sz w:val="40"/>
+                <w:szCs w:val="40"/>
               </w:rPr>
             </w:pPr>
             <w:r>
               <w:rPr>
-                <w:sz w:val="28"/>
-                <w:szCs w:val="28"/>
-              </w:rPr>
-              <w:t xml:space="preserve">Giờ in: </w:t>
-            </w:r>
-            <w:r>
-              <w:rPr>
-                <w:sz w:val="28"/>
-                <w:szCs w:val="28"/>
-              </w:rPr>
-              <w:t>{checkout_time}</w:t>
+                <w:sz w:val="40"/>
+                <w:szCs w:val="40"/>
+              </w:rPr>
+              <w:t>Giờ in: {checkout_time}</w:t>
             </w:r>
           </w:p>
         </w:tc>
@@ -284,9 +286,9 @@
         <w:tblLook w:val="04A0" w:firstRow="1" w:lastRow="0" w:firstColumn="1" w:lastColumn="0" w:noHBand="0" w:noVBand="1"/>
       </w:tblPr>
       <w:tblGrid>
-        <w:gridCol w:w="4957"/>
-        <w:gridCol w:w="2693"/>
-        <w:gridCol w:w="2273"/>
+        <w:gridCol w:w="4727"/>
+        <w:gridCol w:w="2612"/>
+        <w:gridCol w:w="2584"/>
       </w:tblGrid>
       <w:tr>
         <w:trPr>
@@ -300,16 +302,16 @@
           <w:p>
             <w:pPr>
               <w:rPr>
-                <w:sz w:val="28"/>
-                <w:szCs w:val="28"/>
+                <w:sz w:val="40"/>
+                <w:szCs w:val="40"/>
               </w:rPr>
             </w:pPr>
             <w:r>
               <w:rPr>
                 <w:b/>
                 <w:bCs/>
-                <w:sz w:val="28"/>
-                <w:szCs w:val="28"/>
+                <w:sz w:val="40"/>
+                <w:szCs w:val="40"/>
               </w:rPr>
               <w:t>Mặt hàng</w:t>
             </w:r>
@@ -324,23 +326,16 @@
             <w:pPr>
               <w:jc w:val="center"/>
               <w:rPr>
-                <w:sz w:val="28"/>
-                <w:szCs w:val="28"/>
+                <w:sz w:val="40"/>
+                <w:szCs w:val="40"/>
               </w:rPr>
             </w:pPr>
             <w:r>
               <w:rPr>
-                <w:sz w:val="28"/>
-                <w:szCs w:val="28"/>
-              </w:rPr>
-              <w:t>SL</w:t>
-            </w:r>
-            <w:r>
-              <w:rPr>
-                <w:sz w:val="28"/>
-                <w:szCs w:val="28"/>
-              </w:rPr>
-              <w:t>/TL</w:t>
+                <w:sz w:val="40"/>
+                <w:szCs w:val="40"/>
+              </w:rPr>
+              <w:t>SL/TL</w:t>
             </w:r>
           </w:p>
         </w:tc>
@@ -353,14 +348,14 @@
             <w:pPr>
               <w:jc w:val="right"/>
               <w:rPr>
-                <w:sz w:val="28"/>
-                <w:szCs w:val="28"/>
+                <w:sz w:val="40"/>
+                <w:szCs w:val="40"/>
               </w:rPr>
             </w:pPr>
             <w:r>
               <w:rPr>
-                <w:sz w:val="28"/>
-                <w:szCs w:val="28"/>
+                <w:sz w:val="40"/>
+                <w:szCs w:val="40"/>
               </w:rPr>
               <w:t>T.Tiền</w:t>
             </w:r>
@@ -379,35 +374,21 @@
           <w:p>
             <w:pPr>
               <w:rPr>
-                <w:sz w:val="28"/>
-                <w:szCs w:val="28"/>
+                <w:sz w:val="40"/>
+                <w:szCs w:val="40"/>
               </w:rPr>
             </w:pPr>
             <w:r>
               <w:rPr>
-                <w:sz w:val="28"/>
-                <w:szCs w:val="28"/>
-              </w:rPr>
-              <w:t>{#items</w:t>
-            </w:r>
-            <w:r>
-              <w:rPr>
-                <w:sz w:val="28"/>
-                <w:szCs w:val="28"/>
-              </w:rPr>
-              <w:t xml:space="preserve">} </w:t>
-            </w:r>
-            <w:r>
-              <w:rPr>
-                <w:sz w:val="28"/>
-                <w:szCs w:val="28"/>
-              </w:rPr>
-              <w:t>{name}</w:t>
-            </w:r>
-            <w:r>
-              <w:rPr>
-                <w:sz w:val="28"/>
-                <w:szCs w:val="28"/>
+                <w:sz w:val="40"/>
+                <w:szCs w:val="40"/>
+              </w:rPr>
+              <w:t>{#items} {name}</w:t>
+            </w:r>
+            <w:r>
+              <w:rPr>
+                <w:sz w:val="40"/>
+                <w:szCs w:val="40"/>
               </w:rPr>
               <w:br/>
             </w:r>
@@ -415,15 +396,15 @@
               <w:rPr>
                 <w:i/>
                 <w:iCs/>
-                <w:sz w:val="22"/>
-                <w:szCs w:val="22"/>
+                <w:sz w:val="40"/>
+                <w:szCs w:val="40"/>
               </w:rPr>
               <w:t>{options_text}</w:t>
             </w:r>
             <w:r>
               <w:rPr>
-                <w:sz w:val="28"/>
-                <w:szCs w:val="28"/>
+                <w:sz w:val="40"/>
+                <w:szCs w:val="40"/>
               </w:rPr>
               <w:br/>
             </w:r>
@@ -431,8 +412,8 @@
               <w:rPr>
                 <w:i/>
                 <w:iCs/>
-                <w:sz w:val="22"/>
-                <w:szCs w:val="22"/>
+                <w:sz w:val="40"/>
+                <w:szCs w:val="40"/>
               </w:rPr>
               <w:t>{notes}</w:t>
             </w:r>
@@ -447,14 +428,14 @@
             <w:pPr>
               <w:jc w:val="center"/>
               <w:rPr>
-                <w:sz w:val="28"/>
-                <w:szCs w:val="28"/>
+                <w:sz w:val="40"/>
+                <w:szCs w:val="40"/>
               </w:rPr>
             </w:pPr>
             <w:r>
               <w:rPr>
-                <w:sz w:val="28"/>
-                <w:szCs w:val="28"/>
+                <w:sz w:val="40"/>
+                <w:szCs w:val="40"/>
               </w:rPr>
               <w:t>{quantity}</w:t>
             </w:r>
@@ -469,14 +450,14 @@
             <w:pPr>
               <w:jc w:val="right"/>
               <w:rPr>
-                <w:sz w:val="28"/>
-                <w:szCs w:val="28"/>
+                <w:sz w:val="40"/>
+                <w:szCs w:val="40"/>
               </w:rPr>
             </w:pPr>
             <w:r>
               <w:rPr>
-                <w:sz w:val="28"/>
-                <w:szCs w:val="28"/>
+                <w:sz w:val="40"/>
+                <w:szCs w:val="40"/>
               </w:rPr>
               <w:t>{total}{/items}</w:t>
             </w:r>
@@ -488,8 +469,8 @@
       <w:pPr>
         <w:spacing w:line="240" w:lineRule="auto"/>
         <w:rPr>
-          <w:sz w:val="28"/>
-          <w:szCs w:val="28"/>
+          <w:sz w:val="40"/>
+          <w:szCs w:val="40"/>
         </w:rPr>
       </w:pPr>
     </w:p>
@@ -522,28 +503,28 @@
           <w:p>
             <w:pPr>
               <w:rPr>
-                <w:sz w:val="28"/>
-                <w:szCs w:val="28"/>
+                <w:sz w:val="40"/>
+                <w:szCs w:val="40"/>
               </w:rPr>
             </w:pPr>
             <w:r>
               <w:rPr>
-                <w:sz w:val="28"/>
-                <w:szCs w:val="28"/>
+                <w:sz w:val="40"/>
+                <w:szCs w:val="40"/>
               </w:rPr>
               <w:t>Tiền hàng</w:t>
             </w:r>
             <w:r>
               <w:rPr>
-                <w:sz w:val="28"/>
-                <w:szCs w:val="28"/>
+                <w:sz w:val="40"/>
+                <w:szCs w:val="40"/>
               </w:rPr>
               <w:t xml:space="preserve"> </w:t>
             </w:r>
             <w:r>
               <w:rPr>
-                <w:sz w:val="28"/>
-                <w:szCs w:val="28"/>
+                <w:sz w:val="40"/>
+                <w:szCs w:val="40"/>
               </w:rPr>
               <w:t>({total_items})</w:t>
             </w:r>
@@ -557,16 +538,16 @@
             <w:pPr>
               <w:jc w:val="right"/>
               <w:rPr>
-                <w:sz w:val="28"/>
-                <w:szCs w:val="28"/>
+                <w:sz w:val="40"/>
+                <w:szCs w:val="40"/>
               </w:rPr>
             </w:pPr>
             <w:r>
               <w:rPr>
                 <w:b/>
                 <w:bCs/>
-                <w:sz w:val="28"/>
-                <w:szCs w:val="28"/>
+                <w:sz w:val="40"/>
+                <w:szCs w:val="40"/>
               </w:rPr>
               <w:t xml:space="preserve"> {final_total}</w:t>
             </w:r>
@@ -586,16 +567,16 @@
               <w:rPr>
                 <w:b/>
                 <w:bCs/>
-                <w:sz w:val="28"/>
-                <w:szCs w:val="28"/>
+                <w:sz w:val="40"/>
+                <w:szCs w:val="40"/>
               </w:rPr>
             </w:pPr>
             <w:r>
               <w:rPr>
                 <w:b/>
                 <w:bCs/>
-                <w:sz w:val="28"/>
-                <w:szCs w:val="28"/>
+                <w:sz w:val="40"/>
+                <w:szCs w:val="40"/>
               </w:rPr>
               <w:t>THANH TOÁN</w:t>
             </w:r>
@@ -609,16 +590,16 @@
             <w:pPr>
               <w:jc w:val="right"/>
               <w:rPr>
-                <w:sz w:val="28"/>
-                <w:szCs w:val="28"/>
+                <w:sz w:val="40"/>
+                <w:szCs w:val="40"/>
               </w:rPr>
             </w:pPr>
             <w:r>
               <w:rPr>
                 <w:b/>
                 <w:bCs/>
-                <w:sz w:val="28"/>
-                <w:szCs w:val="28"/>
+                <w:sz w:val="40"/>
+                <w:szCs w:val="40"/>
               </w:rPr>
               <w:t>{final_total}</w:t>
             </w:r>
@@ -626,8 +607,8 @@
               <w:rPr>
                 <w:b/>
                 <w:bCs/>
-                <w:sz w:val="28"/>
-                <w:szCs w:val="28"/>
+                <w:sz w:val="40"/>
+                <w:szCs w:val="40"/>
                 <w:u w:val="single"/>
               </w:rPr>
               <w:t>đ</w:t>
@@ -640,8 +621,8 @@
       <w:pPr>
         <w:spacing w:line="240" w:lineRule="auto"/>
         <w:rPr>
-          <w:sz w:val="28"/>
-          <w:szCs w:val="28"/>
+          <w:sz w:val="40"/>
+          <w:szCs w:val="40"/>
         </w:rPr>
       </w:pPr>
     </w:p>
@@ -653,28 +634,28 @@
         <w:spacing w:after="0" w:line="240" w:lineRule="auto"/>
         <w:jc w:val="center"/>
         <w:rPr>
-          <w:sz w:val="36"/>
-          <w:szCs w:val="36"/>
+          <w:sz w:val="40"/>
+          <w:szCs w:val="40"/>
         </w:rPr>
       </w:pPr>
       <w:r>
         <w:rPr>
-          <w:sz w:val="36"/>
-          <w:szCs w:val="36"/>
+          <w:sz w:val="40"/>
+          <w:szCs w:val="40"/>
         </w:rPr>
         <w:t xml:space="preserve">Tấm xin cảm ơn </w:t>
       </w:r>
       <w:r>
         <w:rPr>
-          <w:sz w:val="36"/>
-          <w:szCs w:val="36"/>
+          <w:sz w:val="40"/>
+          <w:szCs w:val="40"/>
         </w:rPr>
         <w:t>và hẹn gặp lại</w:t>
       </w:r>
       <w:r>
         <w:rPr>
-          <w:sz w:val="36"/>
-          <w:szCs w:val="36"/>
+          <w:sz w:val="40"/>
+          <w:szCs w:val="40"/>
         </w:rPr>
         <w:t>!</w:t>
       </w:r>
@@ -689,16 +670,16 @@
         <w:rPr>
           <w:b/>
           <w:bCs/>
-          <w:sz w:val="36"/>
-          <w:szCs w:val="36"/>
+          <w:sz w:val="40"/>
+          <w:szCs w:val="40"/>
         </w:rPr>
       </w:pPr>
       <w:r>
         <w:rPr>
           <w:b/>
           <w:bCs/>
-          <w:sz w:val="36"/>
-          <w:szCs w:val="36"/>
+          <w:sz w:val="40"/>
+          <w:szCs w:val="40"/>
         </w:rPr>
         <w:t>Wifi: Tam xua – Pass: xincamon</w:t>
       </w:r>
@@ -1316,6 +1297,7 @@
   <w:style w:type="character" w:default="1" w:styleId="DefaultParagraphFont">
     <w:name w:val="Default Paragraph Font"/>
     <w:uiPriority w:val="1"/>
+    <w:semiHidden/>
     <w:unhideWhenUsed/>
   </w:style>
   <w:style w:type="table" w:default="1" w:styleId="TableNormal">

</xml_diff>

<commit_message>
Cap nhat cau truc database va cac mau hoa don docx
</commit_message>
<xml_diff>
--- a/templates/hoadon.docx
+++ b/templates/hoadon.docx
@@ -1,84 +1,85 @@
 
 <file path=word/document.xml><?xml version="1.0" encoding="utf-8"?>
-<w:document xmlns:wpc="http://schemas.microsoft.com/office/word/2010/wordprocessingCanvas" xmlns:cx="http://schemas.microsoft.com/office/drawing/2014/chartex" xmlns:cx1="http://schemas.microsoft.com/office/drawing/2015/9/8/chartex" xmlns:cx2="http://schemas.microsoft.com/office/drawing/2015/10/21/chartex" xmlns:cx3="http://schemas.microsoft.com/office/drawing/2016/5/9/chartex" xmlns:cx4="http://schemas.microsoft.com/office/drawing/2016/5/10/chartex" xmlns:cx5="http://schemas.microsoft.com/office/drawing/2016/5/11/chartex" xmlns:cx6="http://schemas.microsoft.com/office/drawing/2016/5/12/chartex" xmlns:cx7="http://schemas.microsoft.com/office/drawing/2016/5/13/chartex" xmlns:cx8="http://schemas.microsoft.com/office/drawing/2016/5/14/chartex" xmlns:mc="http://schemas.openxmlformats.org/markup-compatibility/2006" xmlns:aink="http://schemas.microsoft.com/office/drawing/2016/ink" xmlns:am3d="http://schemas.microsoft.com/office/drawing/2017/model3d" xmlns:o="urn:schemas-microsoft-com:office:office" xmlns:oel="http://schemas.microsoft.com/office/2019/extlst" xmlns:r="http://schemas.openxmlformats.org/officeDocument/2006/relationships" xmlns:m="http://schemas.openxmlformats.org/officeDocument/2006/math" xmlns:v="urn:schemas-microsoft-com:vml" xmlns:wp14="http://schemas.microsoft.com/office/word/2010/wordprocessingDrawing" xmlns:wp="http://schemas.openxmlformats.org/drawingml/2006/wordprocessingDrawing" xmlns:w10="urn:schemas-microsoft-com:office:word" xmlns:w="http://schemas.openxmlformats.org/wordprocessingml/2006/main" xmlns:w14="http://schemas.microsoft.com/office/word/2010/wordml" xmlns:w15="http://schemas.microsoft.com/office/word/2012/wordml" xmlns:w16cex="http://schemas.microsoft.com/office/word/2018/wordml/cex" xmlns:w16cid="http://schemas.microsoft.com/office/word/2016/wordml/cid" xmlns:w16="http://schemas.microsoft.com/office/word/2018/wordml" xmlns:w16du="http://schemas.microsoft.com/office/word/2023/wordml/word16du" xmlns:w16sdtdh="http://schemas.microsoft.com/office/word/2020/wordml/sdtdatahash" xmlns:w16sdtfl="http://schemas.microsoft.com/office/word/2024/wordml/sdtformatlock" xmlns:w16se="http://schemas.microsoft.com/office/word/2015/wordml/symex" xmlns:wpg="http://schemas.microsoft.com/office/word/2010/wordprocessingGroup" xmlns:wpi="http://schemas.microsoft.com/office/word/2010/wordprocessingInk" xmlns:wne="http://schemas.microsoft.com/office/word/2006/wordml" xmlns:wps="http://schemas.microsoft.com/office/word/2010/wordprocessingShape" mc:Ignorable="w14 w15 w16se w16cid w16 w16cex w16sdtdh w16sdtfl w16du wp14">
+<w:document xmlns:wpc="http://schemas.microsoft.com/office/word/2010/wordprocessingCanvas" xmlns:cx="http://schemas.microsoft.com/office/drawing/2014/chartex" xmlns:cx1="http://schemas.microsoft.com/office/drawing/2015/9/8/chartex" xmlns:cx2="http://schemas.microsoft.com/office/drawing/2015/10/21/chartex" xmlns:cx3="http://schemas.microsoft.com/office/drawing/2016/5/9/chartex" xmlns:cx4="http://schemas.microsoft.com/office/drawing/2016/5/10/chartex" xmlns:cx5="http://schemas.microsoft.com/office/drawing/2016/5/11/chartex" xmlns:cx6="http://schemas.microsoft.com/office/drawing/2016/5/12/chartex" xmlns:cx7="http://schemas.microsoft.com/office/drawing/2016/5/13/chartex" xmlns:cx8="http://schemas.microsoft.com/office/drawing/2016/5/14/chartex" xmlns:mc="http://schemas.openxmlformats.org/markup-compatibility/2006" xmlns:aink="http://schemas.microsoft.com/office/drawing/2016/ink" xmlns:am3d="http://schemas.microsoft.com/office/drawing/2017/model3d" xmlns:o="urn:schemas-microsoft-com:office:office" xmlns:oel="http://schemas.microsoft.com/office/2019/extlst" xmlns:r="http://schemas.openxmlformats.org/officeDocument/2006/relationships" xmlns:m="http://schemas.openxmlformats.org/officeDocument/2006/math" xmlns:v="urn:schemas-microsoft-com:vml" xmlns:wp14="http://schemas.microsoft.com/office/word/2010/wordprocessingDrawing" xmlns:wp="http://schemas.openxmlformats.org/drawingml/2006/wordprocessingDrawing" xmlns:w10="urn:schemas-microsoft-com:office:word" xmlns:w="http://schemas.openxmlformats.org/wordprocessingml/2006/main" xmlns:w14="http://schemas.microsoft.com/office/word/2010/wordml" xmlns:w15="http://schemas.microsoft.com/office/word/2012/wordml" xmlns:w16cei="http://schemas.microsoft.com/office/word/2026/wordml/cei" xmlns:w16cex="http://schemas.microsoft.com/office/word/2018/wordml/cex" xmlns:w16cid="http://schemas.microsoft.com/office/word/2016/wordml/cid" xmlns:w16="http://schemas.microsoft.com/office/word/2018/wordml" xmlns:w16du="http://schemas.microsoft.com/office/word/2023/wordml/word16du" xmlns:w16sdtdh="http://schemas.microsoft.com/office/word/2020/wordml/sdtdatahash" xmlns:w16sdtfl="http://schemas.microsoft.com/office/word/2024/wordml/sdtformatlock" xmlns:w16se="http://schemas.microsoft.com/office/word/2015/wordml/symex" xmlns:wpg="http://schemas.microsoft.com/office/word/2010/wordprocessingGroup" xmlns:wpi="http://schemas.microsoft.com/office/word/2010/wordprocessingInk" xmlns:wne="http://schemas.microsoft.com/office/word/2006/wordml" xmlns:wps="http://schemas.microsoft.com/office/word/2010/wordprocessingShape" mc:Ignorable="w14 w15 w16se w16cid w16 w16cex w16sdtdh w16sdtfl w16du wp14">
   <w:body>
     <w:p>
       <w:pPr>
-        <w:spacing w:line="240" w:lineRule="auto"/>
+        <w:spacing w:after="0" w:line="240" w:lineRule="auto"/>
+        <w:ind w:left="-1418" w:right="-1440"/>
         <w:jc w:val="center"/>
         <w:rPr>
           <w:b/>
           <w:bCs/>
-          <w:sz w:val="52"/>
-          <w:szCs w:val="52"/>
+          <w:sz w:val="14"/>
+          <w:szCs w:val="14"/>
         </w:rPr>
       </w:pPr>
       <w:r>
         <w:rPr>
           <w:b/>
           <w:bCs/>
-          <w:sz w:val="52"/>
-          <w:szCs w:val="52"/>
+          <w:sz w:val="14"/>
+          <w:szCs w:val="14"/>
         </w:rPr>
         <w:t>TẤM XƯA</w:t>
       </w:r>
     </w:p>
     <w:p>
       <w:pPr>
-        <w:spacing w:line="240" w:lineRule="auto"/>
+        <w:spacing w:after="0" w:line="240" w:lineRule="auto"/>
         <w:jc w:val="center"/>
         <w:rPr>
-          <w:sz w:val="52"/>
-          <w:szCs w:val="52"/>
+          <w:sz w:val="14"/>
+          <w:szCs w:val="14"/>
         </w:rPr>
       </w:pPr>
       <w:r>
         <w:rPr>
-          <w:sz w:val="52"/>
-          <w:szCs w:val="52"/>
+          <w:sz w:val="14"/>
+          <w:szCs w:val="14"/>
         </w:rPr>
         <w:t>142 Nguyễn Văn Triết</w:t>
       </w:r>
       <w:r>
         <w:rPr>
-          <w:sz w:val="52"/>
-          <w:szCs w:val="52"/>
+          <w:sz w:val="14"/>
+          <w:szCs w:val="14"/>
         </w:rPr>
         <w:t>, Thành phố Hồ Chí Minh</w:t>
       </w:r>
     </w:p>
     <w:p>
       <w:pPr>
-        <w:spacing w:line="240" w:lineRule="auto"/>
+        <w:spacing w:after="0" w:line="240" w:lineRule="auto"/>
         <w:jc w:val="center"/>
         <w:rPr>
-          <w:sz w:val="52"/>
-          <w:szCs w:val="52"/>
+          <w:sz w:val="14"/>
+          <w:szCs w:val="14"/>
         </w:rPr>
       </w:pPr>
       <w:r>
         <w:rPr>
-          <w:sz w:val="52"/>
-          <w:szCs w:val="52"/>
+          <w:sz w:val="14"/>
+          <w:szCs w:val="14"/>
         </w:rPr>
         <w:t>SĐT: 0392405017</w:t>
       </w:r>
     </w:p>
     <w:p>
       <w:pPr>
-        <w:spacing w:line="240" w:lineRule="auto"/>
+        <w:spacing w:after="0" w:line="240" w:lineRule="auto"/>
         <w:jc w:val="center"/>
         <w:rPr>
-          <w:sz w:val="52"/>
-          <w:szCs w:val="52"/>
+          <w:sz w:val="14"/>
+          <w:szCs w:val="14"/>
         </w:rPr>
       </w:pPr>
       <w:r>
         <w:rPr>
           <w:b/>
           <w:bCs/>
-          <w:sz w:val="52"/>
-          <w:szCs w:val="52"/>
+          <w:sz w:val="14"/>
+          <w:szCs w:val="14"/>
         </w:rPr>
         <w:t>HOÁ ĐƠN</w:t>
       </w:r>
@@ -86,8 +87,8 @@
         <w:rPr>
           <w:b/>
           <w:bCs/>
-          <w:sz w:val="52"/>
-          <w:szCs w:val="52"/>
+          <w:sz w:val="14"/>
+          <w:szCs w:val="14"/>
         </w:rPr>
         <w:t xml:space="preserve"> THANH TOÁN</w:t>
       </w:r>
@@ -95,15 +96,15 @@
         <w:rPr>
           <w:b/>
           <w:bCs/>
-          <w:sz w:val="52"/>
-          <w:szCs w:val="52"/>
+          <w:sz w:val="14"/>
+          <w:szCs w:val="14"/>
         </w:rPr>
         <w:br/>
       </w:r>
       <w:r>
         <w:rPr>
-          <w:sz w:val="40"/>
-          <w:szCs w:val="40"/>
+          <w:sz w:val="14"/>
+          <w:szCs w:val="14"/>
         </w:rPr>
         <w:t xml:space="preserve">Số: </w:t>
       </w:r>
@@ -111,42 +112,55 @@
         <w:rPr>
           <w:b/>
           <w:bCs/>
-          <w:sz w:val="40"/>
-          <w:szCs w:val="40"/>
+          <w:sz w:val="14"/>
+          <w:szCs w:val="14"/>
         </w:rPr>
         <w:t>100006435</w:t>
       </w:r>
     </w:p>
     <w:p>
       <w:pPr>
-        <w:spacing w:line="240" w:lineRule="auto"/>
+        <w:spacing w:after="0" w:line="240" w:lineRule="auto"/>
         <w:jc w:val="center"/>
         <w:rPr>
-          <w:sz w:val="40"/>
-          <w:szCs w:val="40"/>
+          <w:sz w:val="14"/>
+          <w:szCs w:val="14"/>
         </w:rPr>
       </w:pPr>
       <w:r>
         <w:rPr>
-          <w:sz w:val="40"/>
-          <w:szCs w:val="40"/>
-        </w:rPr>
-        <w:t>----------------------------------------------------</w:t>
+          <w:sz w:val="14"/>
+          <w:szCs w:val="14"/>
+        </w:rPr>
+        <w:t>-------------</w:t>
       </w:r>
       <w:r>
         <w:rPr>
-          <w:b/>
-          <w:bCs/>
-          <w:sz w:val="40"/>
-          <w:szCs w:val="40"/>
-        </w:rPr>
-        <w:tab/>
+          <w:sz w:val="14"/>
+          <w:szCs w:val="14"/>
+        </w:rPr>
+        <w:t>-</w:t>
+      </w:r>
+      <w:r>
+        <w:rPr>
+          <w:sz w:val="14"/>
+          <w:szCs w:val="14"/>
+        </w:rPr>
+        <w:t>--------</w:t>
+      </w:r>
+      <w:r>
+        <w:rPr>
+          <w:sz w:val="14"/>
+          <w:szCs w:val="14"/>
+        </w:rPr>
+        <w:t>-------------------------------------------------</w:t>
       </w:r>
     </w:p>
     <w:tbl>
       <w:tblPr>
         <w:tblStyle w:val="TableGrid"/>
-        <w:tblW w:w="9923" w:type="dxa"/>
+        <w:tblW w:w="3478" w:type="dxa"/>
+        <w:jc w:val="center"/>
         <w:tblBorders>
           <w:top w:val="none" w:sz="0" w:space="0" w:color="auto"/>
           <w:left w:val="none" w:sz="0" w:space="0" w:color="auto"/>
@@ -158,31 +172,32 @@
         <w:tblLook w:val="04A0" w:firstRow="1" w:lastRow="0" w:firstColumn="1" w:lastColumn="0" w:noHBand="0" w:noVBand="1"/>
       </w:tblPr>
       <w:tblGrid>
-        <w:gridCol w:w="4961"/>
-        <w:gridCol w:w="4962"/>
+        <w:gridCol w:w="1739"/>
+        <w:gridCol w:w="1739"/>
       </w:tblGrid>
       <w:tr>
         <w:trPr>
-          <w:trHeight w:val="418"/>
+          <w:trHeight w:val="241"/>
+          <w:jc w:val="center"/>
         </w:trPr>
         <w:tc>
           <w:tcPr>
-            <w:tcW w:w="4944" w:type="dxa"/>
+            <w:tcW w:w="1739" w:type="dxa"/>
             <w:vAlign w:val="center"/>
           </w:tcPr>
           <w:p>
             <w:pPr>
               <w:rPr>
-                <w:sz w:val="40"/>
-                <w:szCs w:val="40"/>
+                <w:sz w:val="14"/>
+                <w:szCs w:val="14"/>
               </w:rPr>
             </w:pPr>
             <w:r>
               <w:rPr>
                 <w:b/>
                 <w:bCs/>
-                <w:sz w:val="40"/>
-                <w:szCs w:val="40"/>
+                <w:sz w:val="14"/>
+                <w:szCs w:val="14"/>
               </w:rPr>
               <w:t xml:space="preserve">Tại bàn: </w:t>
             </w:r>
@@ -190,8 +205,8 @@
               <w:rPr>
                 <w:b/>
                 <w:bCs/>
-                <w:sz w:val="40"/>
-                <w:szCs w:val="40"/>
+                <w:sz w:val="14"/>
+                <w:szCs w:val="14"/>
               </w:rPr>
               <w:tab/>
             </w:r>
@@ -199,23 +214,23 @@
         </w:tc>
         <w:tc>
           <w:tcPr>
-            <w:tcW w:w="4945" w:type="dxa"/>
+            <w:tcW w:w="1739" w:type="dxa"/>
             <w:vAlign w:val="center"/>
           </w:tcPr>
           <w:p>
             <w:pPr>
               <w:jc w:val="right"/>
               <w:rPr>
-                <w:sz w:val="40"/>
-                <w:szCs w:val="40"/>
+                <w:sz w:val="14"/>
+                <w:szCs w:val="14"/>
               </w:rPr>
             </w:pPr>
             <w:r>
               <w:rPr>
                 <w:b/>
                 <w:bCs/>
-                <w:sz w:val="40"/>
-                <w:szCs w:val="40"/>
+                <w:sz w:val="14"/>
+                <w:szCs w:val="14"/>
               </w:rPr>
               <w:t>{table_name}</w:t>
             </w:r>
@@ -224,31 +239,32 @@
       </w:tr>
       <w:tr>
         <w:trPr>
-          <w:trHeight w:val="269"/>
+          <w:trHeight w:val="295"/>
+          <w:jc w:val="center"/>
         </w:trPr>
         <w:tc>
           <w:tcPr>
-            <w:tcW w:w="4944" w:type="dxa"/>
+            <w:tcW w:w="1739" w:type="dxa"/>
             <w:vAlign w:val="center"/>
           </w:tcPr>
           <w:p>
             <w:pPr>
               <w:rPr>
-                <w:sz w:val="40"/>
-                <w:szCs w:val="40"/>
+                <w:sz w:val="14"/>
+                <w:szCs w:val="14"/>
               </w:rPr>
             </w:pPr>
             <w:r>
               <w:rPr>
-                <w:sz w:val="40"/>
-                <w:szCs w:val="40"/>
+                <w:sz w:val="14"/>
+                <w:szCs w:val="14"/>
               </w:rPr>
               <w:t>Giờ vào: {order_time}</w:t>
             </w:r>
             <w:r>
               <w:rPr>
-                <w:sz w:val="40"/>
-                <w:szCs w:val="40"/>
+                <w:sz w:val="14"/>
+                <w:szCs w:val="14"/>
               </w:rPr>
               <w:tab/>
             </w:r>
@@ -256,21 +272,21 @@
         </w:tc>
         <w:tc>
           <w:tcPr>
-            <w:tcW w:w="4945" w:type="dxa"/>
+            <w:tcW w:w="1739" w:type="dxa"/>
             <w:vAlign w:val="center"/>
           </w:tcPr>
           <w:p>
             <w:pPr>
               <w:jc w:val="right"/>
               <w:rPr>
-                <w:sz w:val="40"/>
-                <w:szCs w:val="40"/>
+                <w:sz w:val="14"/>
+                <w:szCs w:val="14"/>
               </w:rPr>
             </w:pPr>
             <w:r>
               <w:rPr>
-                <w:sz w:val="40"/>
-                <w:szCs w:val="40"/>
+                <w:sz w:val="14"/>
+                <w:szCs w:val="14"/>
               </w:rPr>
               <w:t>Giờ in: {checkout_time}</w:t>
             </w:r>
@@ -281,37 +297,37 @@
     <w:tbl>
       <w:tblPr>
         <w:tblStyle w:val="TableGrid"/>
-        <w:tblpPr w:leftFromText="180" w:rightFromText="180" w:vertAnchor="text" w:horzAnchor="margin" w:tblpY="280"/>
-        <w:tblW w:w="9923" w:type="dxa"/>
+        <w:tblpPr w:leftFromText="180" w:rightFromText="180" w:vertAnchor="text" w:horzAnchor="margin" w:tblpXSpec="center" w:tblpY="280"/>
+        <w:tblW w:w="3581" w:type="dxa"/>
         <w:tblLook w:val="04A0" w:firstRow="1" w:lastRow="0" w:firstColumn="1" w:lastColumn="0" w:noHBand="0" w:noVBand="1"/>
       </w:tblPr>
       <w:tblGrid>
-        <w:gridCol w:w="4727"/>
-        <w:gridCol w:w="2612"/>
-        <w:gridCol w:w="2584"/>
+        <w:gridCol w:w="1339"/>
+        <w:gridCol w:w="960"/>
+        <w:gridCol w:w="1282"/>
       </w:tblGrid>
       <w:tr>
         <w:trPr>
-          <w:trHeight w:val="371"/>
+          <w:trHeight w:val="275"/>
         </w:trPr>
         <w:tc>
           <w:tcPr>
-            <w:tcW w:w="4957" w:type="dxa"/>
+            <w:tcW w:w="1789" w:type="dxa"/>
             <w:vAlign w:val="center"/>
           </w:tcPr>
           <w:p>
             <w:pPr>
               <w:rPr>
-                <w:sz w:val="40"/>
-                <w:szCs w:val="40"/>
+                <w:sz w:val="18"/>
+                <w:szCs w:val="18"/>
               </w:rPr>
             </w:pPr>
             <w:r>
               <w:rPr>
                 <w:b/>
                 <w:bCs/>
-                <w:sz w:val="40"/>
-                <w:szCs w:val="40"/>
+                <w:sz w:val="18"/>
+                <w:szCs w:val="18"/>
               </w:rPr>
               <w:t>Mặt hàng</w:t>
             </w:r>
@@ -319,21 +335,21 @@
         </w:tc>
         <w:tc>
           <w:tcPr>
-            <w:tcW w:w="2693" w:type="dxa"/>
+            <w:tcW w:w="972" w:type="dxa"/>
             <w:vAlign w:val="center"/>
           </w:tcPr>
           <w:p>
             <w:pPr>
               <w:jc w:val="center"/>
               <w:rPr>
-                <w:sz w:val="40"/>
-                <w:szCs w:val="40"/>
+                <w:sz w:val="18"/>
+                <w:szCs w:val="18"/>
               </w:rPr>
             </w:pPr>
             <w:r>
               <w:rPr>
-                <w:sz w:val="40"/>
-                <w:szCs w:val="40"/>
+                <w:sz w:val="18"/>
+                <w:szCs w:val="18"/>
               </w:rPr>
               <w:t>SL/TL</w:t>
             </w:r>
@@ -341,21 +357,21 @@
         </w:tc>
         <w:tc>
           <w:tcPr>
-            <w:tcW w:w="2273" w:type="dxa"/>
+            <w:tcW w:w="820" w:type="dxa"/>
             <w:vAlign w:val="center"/>
           </w:tcPr>
           <w:p>
             <w:pPr>
               <w:jc w:val="right"/>
               <w:rPr>
-                <w:sz w:val="40"/>
-                <w:szCs w:val="40"/>
+                <w:sz w:val="18"/>
+                <w:szCs w:val="18"/>
               </w:rPr>
             </w:pPr>
             <w:r>
               <w:rPr>
-                <w:sz w:val="40"/>
-                <w:szCs w:val="40"/>
+                <w:sz w:val="18"/>
+                <w:szCs w:val="18"/>
               </w:rPr>
               <w:t>T.Tiền</w:t>
             </w:r>
@@ -364,31 +380,31 @@
       </w:tr>
       <w:tr>
         <w:trPr>
-          <w:trHeight w:val="969"/>
+          <w:trHeight w:val="561"/>
         </w:trPr>
         <w:tc>
           <w:tcPr>
-            <w:tcW w:w="4957" w:type="dxa"/>
+            <w:tcW w:w="1789" w:type="dxa"/>
             <w:vAlign w:val="center"/>
           </w:tcPr>
           <w:p>
             <w:pPr>
               <w:rPr>
-                <w:sz w:val="40"/>
-                <w:szCs w:val="40"/>
+                <w:sz w:val="18"/>
+                <w:szCs w:val="18"/>
               </w:rPr>
             </w:pPr>
             <w:r>
               <w:rPr>
-                <w:sz w:val="40"/>
-                <w:szCs w:val="40"/>
+                <w:sz w:val="18"/>
+                <w:szCs w:val="18"/>
               </w:rPr>
               <w:t>{#items} {name}</w:t>
             </w:r>
             <w:r>
               <w:rPr>
-                <w:sz w:val="40"/>
-                <w:szCs w:val="40"/>
+                <w:sz w:val="18"/>
+                <w:szCs w:val="18"/>
               </w:rPr>
               <w:br/>
             </w:r>
@@ -396,15 +412,15 @@
               <w:rPr>
                 <w:i/>
                 <w:iCs/>
-                <w:sz w:val="40"/>
-                <w:szCs w:val="40"/>
+                <w:sz w:val="18"/>
+                <w:szCs w:val="18"/>
               </w:rPr>
               <w:t>{options_text}</w:t>
             </w:r>
             <w:r>
               <w:rPr>
-                <w:sz w:val="40"/>
-                <w:szCs w:val="40"/>
+                <w:sz w:val="18"/>
+                <w:szCs w:val="18"/>
               </w:rPr>
               <w:br/>
             </w:r>
@@ -412,8 +428,8 @@
               <w:rPr>
                 <w:i/>
                 <w:iCs/>
-                <w:sz w:val="40"/>
-                <w:szCs w:val="40"/>
+                <w:sz w:val="18"/>
+                <w:szCs w:val="18"/>
               </w:rPr>
               <w:t>{notes}</w:t>
             </w:r>
@@ -421,21 +437,21 @@
         </w:tc>
         <w:tc>
           <w:tcPr>
-            <w:tcW w:w="2693" w:type="dxa"/>
+            <w:tcW w:w="972" w:type="dxa"/>
             <w:vAlign w:val="center"/>
           </w:tcPr>
           <w:p>
             <w:pPr>
               <w:jc w:val="center"/>
               <w:rPr>
-                <w:sz w:val="40"/>
-                <w:szCs w:val="40"/>
+                <w:sz w:val="18"/>
+                <w:szCs w:val="18"/>
               </w:rPr>
             </w:pPr>
             <w:r>
               <w:rPr>
-                <w:sz w:val="40"/>
-                <w:szCs w:val="40"/>
+                <w:sz w:val="18"/>
+                <w:szCs w:val="18"/>
               </w:rPr>
               <w:t>{quantity}</w:t>
             </w:r>
@@ -443,21 +459,21 @@
         </w:tc>
         <w:tc>
           <w:tcPr>
-            <w:tcW w:w="2273" w:type="dxa"/>
+            <w:tcW w:w="820" w:type="dxa"/>
             <w:vAlign w:val="center"/>
           </w:tcPr>
           <w:p>
             <w:pPr>
               <w:jc w:val="right"/>
               <w:rPr>
-                <w:sz w:val="40"/>
-                <w:szCs w:val="40"/>
+                <w:sz w:val="18"/>
+                <w:szCs w:val="18"/>
               </w:rPr>
             </w:pPr>
             <w:r>
               <w:rPr>
-                <w:sz w:val="40"/>
-                <w:szCs w:val="40"/>
+                <w:sz w:val="18"/>
+                <w:szCs w:val="18"/>
               </w:rPr>
               <w:t>{total}{/items}</w:t>
             </w:r>
@@ -465,19 +481,10 @@
         </w:tc>
       </w:tr>
     </w:tbl>
-    <w:p>
-      <w:pPr>
-        <w:spacing w:line="240" w:lineRule="auto"/>
-        <w:rPr>
-          <w:sz w:val="40"/>
-          <w:szCs w:val="40"/>
-        </w:rPr>
-      </w:pPr>
-    </w:p>
     <w:tbl>
       <w:tblPr>
         <w:tblStyle w:val="TableGrid"/>
-        <w:tblW w:w="9925" w:type="dxa"/>
+        <w:tblW w:w="3539" w:type="dxa"/>
         <w:tblBorders>
           <w:top w:val="none" w:sz="0" w:space="0" w:color="auto"/>
           <w:left w:val="none" w:sz="0" w:space="0" w:color="auto"/>
@@ -489,42 +496,45 @@
         <w:tblLook w:val="04A0" w:firstRow="1" w:lastRow="0" w:firstColumn="1" w:lastColumn="0" w:noHBand="0" w:noVBand="1"/>
       </w:tblPr>
       <w:tblGrid>
-        <w:gridCol w:w="5262"/>
-        <w:gridCol w:w="4663"/>
+        <w:gridCol w:w="1843"/>
+        <w:gridCol w:w="1696"/>
       </w:tblGrid>
       <w:tr>
         <w:trPr>
-          <w:trHeight w:val="393"/>
+          <w:trHeight w:val="123"/>
         </w:trPr>
         <w:tc>
           <w:tcPr>
-            <w:tcW w:w="5262" w:type="dxa"/>
+            <w:tcW w:w="1843" w:type="dxa"/>
+            <w:tcBorders>
+              <w:bottom w:val="dashed" w:sz="4" w:space="0" w:color="auto"/>
+            </w:tcBorders>
           </w:tcPr>
           <w:p>
             <w:pPr>
               <w:rPr>
-                <w:sz w:val="40"/>
-                <w:szCs w:val="40"/>
+                <w:sz w:val="14"/>
+                <w:szCs w:val="14"/>
               </w:rPr>
             </w:pPr>
             <w:r>
               <w:rPr>
-                <w:sz w:val="40"/>
-                <w:szCs w:val="40"/>
+                <w:sz w:val="14"/>
+                <w:szCs w:val="14"/>
               </w:rPr>
               <w:t>Tiền hàng</w:t>
             </w:r>
             <w:r>
               <w:rPr>
-                <w:sz w:val="40"/>
-                <w:szCs w:val="40"/>
+                <w:sz w:val="14"/>
+                <w:szCs w:val="14"/>
               </w:rPr>
               <w:t xml:space="preserve"> </w:t>
             </w:r>
             <w:r>
               <w:rPr>
-                <w:sz w:val="40"/>
-                <w:szCs w:val="40"/>
+                <w:sz w:val="14"/>
+                <w:szCs w:val="14"/>
               </w:rPr>
               <w:t>({total_items})</w:t>
             </w:r>
@@ -532,22 +542,25 @@
         </w:tc>
         <w:tc>
           <w:tcPr>
-            <w:tcW w:w="4663" w:type="dxa"/>
+            <w:tcW w:w="1696" w:type="dxa"/>
+            <w:tcBorders>
+              <w:bottom w:val="dashed" w:sz="4" w:space="0" w:color="auto"/>
+            </w:tcBorders>
           </w:tcPr>
           <w:p>
             <w:pPr>
               <w:jc w:val="right"/>
               <w:rPr>
-                <w:sz w:val="40"/>
-                <w:szCs w:val="40"/>
+                <w:sz w:val="14"/>
+                <w:szCs w:val="14"/>
               </w:rPr>
             </w:pPr>
             <w:r>
               <w:rPr>
                 <w:b/>
                 <w:bCs/>
-                <w:sz w:val="40"/>
-                <w:szCs w:val="40"/>
+                <w:sz w:val="14"/>
+                <w:szCs w:val="14"/>
               </w:rPr>
               <w:t xml:space="preserve"> {final_total}</w:t>
             </w:r>
@@ -556,27 +569,30 @@
       </w:tr>
       <w:tr>
         <w:trPr>
-          <w:trHeight w:val="407"/>
+          <w:trHeight w:val="225"/>
         </w:trPr>
         <w:tc>
           <w:tcPr>
-            <w:tcW w:w="5262" w:type="dxa"/>
+            <w:tcW w:w="1843" w:type="dxa"/>
+            <w:tcBorders>
+              <w:top w:val="dashed" w:sz="4" w:space="0" w:color="auto"/>
+            </w:tcBorders>
           </w:tcPr>
           <w:p>
             <w:pPr>
               <w:rPr>
                 <w:b/>
                 <w:bCs/>
-                <w:sz w:val="40"/>
-                <w:szCs w:val="40"/>
+                <w:sz w:val="20"/>
+                <w:szCs w:val="20"/>
               </w:rPr>
             </w:pPr>
             <w:r>
               <w:rPr>
                 <w:b/>
                 <w:bCs/>
-                <w:sz w:val="40"/>
-                <w:szCs w:val="40"/>
+                <w:sz w:val="20"/>
+                <w:szCs w:val="20"/>
               </w:rPr>
               <w:t>THANH TOÁN</w:t>
             </w:r>
@@ -584,22 +600,25 @@
         </w:tc>
         <w:tc>
           <w:tcPr>
-            <w:tcW w:w="4663" w:type="dxa"/>
+            <w:tcW w:w="1696" w:type="dxa"/>
+            <w:tcBorders>
+              <w:top w:val="dashed" w:sz="4" w:space="0" w:color="auto"/>
+            </w:tcBorders>
           </w:tcPr>
           <w:p>
             <w:pPr>
               <w:jc w:val="right"/>
               <w:rPr>
-                <w:sz w:val="40"/>
-                <w:szCs w:val="40"/>
+                <w:sz w:val="20"/>
+                <w:szCs w:val="20"/>
               </w:rPr>
             </w:pPr>
             <w:r>
               <w:rPr>
                 <w:b/>
                 <w:bCs/>
-                <w:sz w:val="40"/>
-                <w:szCs w:val="40"/>
+                <w:sz w:val="20"/>
+                <w:szCs w:val="20"/>
               </w:rPr>
               <w:t>{final_total}</w:t>
             </w:r>
@@ -607,11 +626,65 @@
               <w:rPr>
                 <w:b/>
                 <w:bCs/>
-                <w:sz w:val="40"/>
-                <w:szCs w:val="40"/>
+                <w:sz w:val="20"/>
+                <w:szCs w:val="20"/>
                 <w:u w:val="single"/>
               </w:rPr>
               <w:t>đ</w:t>
+            </w:r>
+          </w:p>
+        </w:tc>
+      </w:tr>
+      <w:tr>
+        <w:trPr>
+          <w:trHeight w:val="225"/>
+        </w:trPr>
+        <w:tc>
+          <w:tcPr>
+            <w:tcW w:w="1843" w:type="dxa"/>
+          </w:tcPr>
+          <w:p>
+            <w:pPr>
+              <w:rPr>
+                <w:b/>
+                <w:bCs/>
+                <w:sz w:val="14"/>
+                <w:szCs w:val="14"/>
+              </w:rPr>
+            </w:pPr>
+            <w:r>
+              <w:rPr>
+                <w:b/>
+                <w:bCs/>
+                <w:sz w:val="14"/>
+                <w:szCs w:val="14"/>
+              </w:rPr>
+              <w:t>Chuyển khoản</w:t>
+            </w:r>
+          </w:p>
+        </w:tc>
+        <w:tc>
+          <w:tcPr>
+            <w:tcW w:w="1696" w:type="dxa"/>
+          </w:tcPr>
+          <w:p>
+            <w:pPr>
+              <w:jc w:val="right"/>
+              <w:rPr>
+                <w:b/>
+                <w:bCs/>
+                <w:sz w:val="14"/>
+                <w:szCs w:val="14"/>
+              </w:rPr>
+            </w:pPr>
+            <w:r>
+              <w:rPr>
+                <w:b/>
+                <w:bCs/>
+                <w:sz w:val="14"/>
+                <w:szCs w:val="14"/>
+              </w:rPr>
+              <w:t>{final_total}</w:t>
             </w:r>
           </w:p>
         </w:tc>
@@ -619,10 +692,10 @@
     </w:tbl>
     <w:p>
       <w:pPr>
-        <w:spacing w:line="240" w:lineRule="auto"/>
-        <w:rPr>
-          <w:sz w:val="40"/>
-          <w:szCs w:val="40"/>
+        <w:spacing w:after="0" w:line="240" w:lineRule="auto"/>
+        <w:rPr>
+          <w:sz w:val="14"/>
+          <w:szCs w:val="14"/>
         </w:rPr>
       </w:pPr>
     </w:p>
@@ -634,28 +707,28 @@
         <w:spacing w:after="0" w:line="240" w:lineRule="auto"/>
         <w:jc w:val="center"/>
         <w:rPr>
-          <w:sz w:val="40"/>
-          <w:szCs w:val="40"/>
+          <w:sz w:val="14"/>
+          <w:szCs w:val="14"/>
         </w:rPr>
       </w:pPr>
       <w:r>
         <w:rPr>
-          <w:sz w:val="40"/>
-          <w:szCs w:val="40"/>
+          <w:sz w:val="14"/>
+          <w:szCs w:val="14"/>
         </w:rPr>
         <w:t xml:space="preserve">Tấm xin cảm ơn </w:t>
       </w:r>
       <w:r>
         <w:rPr>
-          <w:sz w:val="40"/>
-          <w:szCs w:val="40"/>
+          <w:sz w:val="14"/>
+          <w:szCs w:val="14"/>
         </w:rPr>
         <w:t>và hẹn gặp lại</w:t>
       </w:r>
       <w:r>
         <w:rPr>
-          <w:sz w:val="40"/>
-          <w:szCs w:val="40"/>
+          <w:sz w:val="14"/>
+          <w:szCs w:val="14"/>
         </w:rPr>
         <w:t>!</w:t>
       </w:r>
@@ -670,23 +743,23 @@
         <w:rPr>
           <w:b/>
           <w:bCs/>
-          <w:sz w:val="40"/>
-          <w:szCs w:val="40"/>
+          <w:sz w:val="14"/>
+          <w:szCs w:val="14"/>
         </w:rPr>
       </w:pPr>
       <w:r>
         <w:rPr>
           <w:b/>
           <w:bCs/>
-          <w:sz w:val="40"/>
-          <w:szCs w:val="40"/>
+          <w:sz w:val="14"/>
+          <w:szCs w:val="14"/>
         </w:rPr>
         <w:t>Wifi: Tam xua – Pass: xincamon</w:t>
       </w:r>
     </w:p>
     <w:sectPr>
-      <w:pgSz w:w="12240" w:h="15840" w:code="1"/>
-      <w:pgMar w:top="1440" w:right="1440" w:bottom="1440" w:left="1440" w:header="720" w:footer="720" w:gutter="0"/>
+      <w:pgSz w:w="4082" w:h="11901" w:code="1"/>
+      <w:pgMar w:top="284" w:right="284" w:bottom="284" w:left="284" w:header="720" w:footer="720" w:gutter="0"/>
       <w:cols w:space="720"/>
       <w:docGrid w:linePitch="360"/>
     </w:sectPr>

</xml_diff>

<commit_message>
Cap nhat mau hoa don hoadon.docx
</commit_message>
<xml_diff>
--- a/templates/hoadon.docx
+++ b/templates/hoadon.docx
@@ -188,16 +188,16 @@
           <w:p>
             <w:pPr>
               <w:rPr>
-                <w:sz w:val="14"/>
-                <w:szCs w:val="14"/>
+                <w:sz w:val="18"/>
+                <w:szCs w:val="18"/>
               </w:rPr>
             </w:pPr>
             <w:r>
               <w:rPr>
                 <w:b/>
                 <w:bCs/>
-                <w:sz w:val="14"/>
-                <w:szCs w:val="14"/>
+                <w:sz w:val="18"/>
+                <w:szCs w:val="18"/>
               </w:rPr>
               <w:t xml:space="preserve">Tại bàn: </w:t>
             </w:r>
@@ -205,8 +205,8 @@
               <w:rPr>
                 <w:b/>
                 <w:bCs/>
-                <w:sz w:val="14"/>
-                <w:szCs w:val="14"/>
+                <w:sz w:val="18"/>
+                <w:szCs w:val="18"/>
               </w:rPr>
               <w:tab/>
             </w:r>
@@ -221,16 +221,16 @@
             <w:pPr>
               <w:jc w:val="right"/>
               <w:rPr>
-                <w:sz w:val="14"/>
-                <w:szCs w:val="14"/>
+                <w:sz w:val="18"/>
+                <w:szCs w:val="18"/>
               </w:rPr>
             </w:pPr>
             <w:r>
               <w:rPr>
                 <w:b/>
                 <w:bCs/>
-                <w:sz w:val="14"/>
-                <w:szCs w:val="14"/>
+                <w:sz w:val="18"/>
+                <w:szCs w:val="18"/>
               </w:rPr>
               <w:t>{table_name}</w:t>
             </w:r>
@@ -250,21 +250,21 @@
           <w:p>
             <w:pPr>
               <w:rPr>
-                <w:sz w:val="14"/>
-                <w:szCs w:val="14"/>
+                <w:sz w:val="18"/>
+                <w:szCs w:val="18"/>
               </w:rPr>
             </w:pPr>
             <w:r>
               <w:rPr>
-                <w:sz w:val="14"/>
-                <w:szCs w:val="14"/>
+                <w:sz w:val="18"/>
+                <w:szCs w:val="18"/>
               </w:rPr>
               <w:t>Giờ vào: {order_time}</w:t>
             </w:r>
             <w:r>
               <w:rPr>
-                <w:sz w:val="14"/>
-                <w:szCs w:val="14"/>
+                <w:sz w:val="18"/>
+                <w:szCs w:val="18"/>
               </w:rPr>
               <w:tab/>
             </w:r>
@@ -279,14 +279,14 @@
             <w:pPr>
               <w:jc w:val="right"/>
               <w:rPr>
-                <w:sz w:val="14"/>
-                <w:szCs w:val="14"/>
+                <w:sz w:val="18"/>
+                <w:szCs w:val="18"/>
               </w:rPr>
             </w:pPr>
             <w:r>
               <w:rPr>
-                <w:sz w:val="14"/>
-                <w:szCs w:val="14"/>
+                <w:sz w:val="18"/>
+                <w:szCs w:val="18"/>
               </w:rPr>
               <w:t>Giờ in: {checkout_time}</w:t>
             </w:r>
@@ -302,9 +302,9 @@
         <w:tblLook w:val="04A0" w:firstRow="1" w:lastRow="0" w:firstColumn="1" w:lastColumn="0" w:noHBand="0" w:noVBand="1"/>
       </w:tblPr>
       <w:tblGrid>
-        <w:gridCol w:w="1339"/>
-        <w:gridCol w:w="960"/>
-        <w:gridCol w:w="1282"/>
+        <w:gridCol w:w="1402"/>
+        <w:gridCol w:w="1041"/>
+        <w:gridCol w:w="1400"/>
       </w:tblGrid>
       <w:tr>
         <w:trPr>
@@ -318,16 +318,16 @@
           <w:p>
             <w:pPr>
               <w:rPr>
-                <w:sz w:val="18"/>
-                <w:szCs w:val="18"/>
+                <w:sz w:val="20"/>
+                <w:szCs w:val="20"/>
               </w:rPr>
             </w:pPr>
             <w:r>
               <w:rPr>
                 <w:b/>
                 <w:bCs/>
-                <w:sz w:val="18"/>
-                <w:szCs w:val="18"/>
+                <w:sz w:val="20"/>
+                <w:szCs w:val="20"/>
               </w:rPr>
               <w:t>Mặt hàng</w:t>
             </w:r>
@@ -342,14 +342,14 @@
             <w:pPr>
               <w:jc w:val="center"/>
               <w:rPr>
-                <w:sz w:val="18"/>
-                <w:szCs w:val="18"/>
+                <w:sz w:val="20"/>
+                <w:szCs w:val="20"/>
               </w:rPr>
             </w:pPr>
             <w:r>
               <w:rPr>
-                <w:sz w:val="18"/>
-                <w:szCs w:val="18"/>
+                <w:sz w:val="20"/>
+                <w:szCs w:val="20"/>
               </w:rPr>
               <w:t>SL/TL</w:t>
             </w:r>
@@ -364,14 +364,14 @@
             <w:pPr>
               <w:jc w:val="right"/>
               <w:rPr>
-                <w:sz w:val="18"/>
-                <w:szCs w:val="18"/>
+                <w:sz w:val="20"/>
+                <w:szCs w:val="20"/>
               </w:rPr>
             </w:pPr>
             <w:r>
               <w:rPr>
-                <w:sz w:val="18"/>
-                <w:szCs w:val="18"/>
+                <w:sz w:val="20"/>
+                <w:szCs w:val="20"/>
               </w:rPr>
               <w:t>T.Tiền</w:t>
             </w:r>
@@ -390,21 +390,21 @@
           <w:p>
             <w:pPr>
               <w:rPr>
-                <w:sz w:val="18"/>
-                <w:szCs w:val="18"/>
+                <w:sz w:val="20"/>
+                <w:szCs w:val="20"/>
               </w:rPr>
             </w:pPr>
             <w:r>
               <w:rPr>
-                <w:sz w:val="18"/>
-                <w:szCs w:val="18"/>
+                <w:sz w:val="20"/>
+                <w:szCs w:val="20"/>
               </w:rPr>
               <w:t>{#items} {name}</w:t>
             </w:r>
             <w:r>
               <w:rPr>
-                <w:sz w:val="18"/>
-                <w:szCs w:val="18"/>
+                <w:sz w:val="20"/>
+                <w:szCs w:val="20"/>
               </w:rPr>
               <w:br/>
             </w:r>
@@ -412,15 +412,15 @@
               <w:rPr>
                 <w:i/>
                 <w:iCs/>
-                <w:sz w:val="18"/>
-                <w:szCs w:val="18"/>
+                <w:sz w:val="20"/>
+                <w:szCs w:val="20"/>
               </w:rPr>
               <w:t>{options_text}</w:t>
             </w:r>
             <w:r>
               <w:rPr>
-                <w:sz w:val="18"/>
-                <w:szCs w:val="18"/>
+                <w:sz w:val="20"/>
+                <w:szCs w:val="20"/>
               </w:rPr>
               <w:br/>
             </w:r>
@@ -428,8 +428,8 @@
               <w:rPr>
                 <w:i/>
                 <w:iCs/>
-                <w:sz w:val="18"/>
-                <w:szCs w:val="18"/>
+                <w:sz w:val="20"/>
+                <w:szCs w:val="20"/>
               </w:rPr>
               <w:t>{notes}</w:t>
             </w:r>
@@ -444,14 +444,14 @@
             <w:pPr>
               <w:jc w:val="center"/>
               <w:rPr>
-                <w:sz w:val="18"/>
-                <w:szCs w:val="18"/>
+                <w:sz w:val="20"/>
+                <w:szCs w:val="20"/>
               </w:rPr>
             </w:pPr>
             <w:r>
               <w:rPr>
-                <w:sz w:val="18"/>
-                <w:szCs w:val="18"/>
+                <w:sz w:val="20"/>
+                <w:szCs w:val="20"/>
               </w:rPr>
               <w:t>{quantity}</w:t>
             </w:r>
@@ -466,14 +466,14 @@
             <w:pPr>
               <w:jc w:val="right"/>
               <w:rPr>
-                <w:sz w:val="18"/>
-                <w:szCs w:val="18"/>
+                <w:sz w:val="20"/>
+                <w:szCs w:val="20"/>
               </w:rPr>
             </w:pPr>
             <w:r>
               <w:rPr>
-                <w:sz w:val="18"/>
-                <w:szCs w:val="18"/>
+                <w:sz w:val="20"/>
+                <w:szCs w:val="20"/>
               </w:rPr>
               <w:t>{total}{/items}</w:t>
             </w:r>
@@ -513,28 +513,28 @@
           <w:p>
             <w:pPr>
               <w:rPr>
-                <w:sz w:val="14"/>
-                <w:szCs w:val="14"/>
+                <w:sz w:val="16"/>
+                <w:szCs w:val="16"/>
               </w:rPr>
             </w:pPr>
             <w:r>
               <w:rPr>
-                <w:sz w:val="14"/>
-                <w:szCs w:val="14"/>
+                <w:sz w:val="16"/>
+                <w:szCs w:val="16"/>
               </w:rPr>
               <w:t>Tiền hàng</w:t>
             </w:r>
             <w:r>
               <w:rPr>
-                <w:sz w:val="14"/>
-                <w:szCs w:val="14"/>
+                <w:sz w:val="16"/>
+                <w:szCs w:val="16"/>
               </w:rPr>
               <w:t xml:space="preserve"> </w:t>
             </w:r>
             <w:r>
               <w:rPr>
-                <w:sz w:val="14"/>
-                <w:szCs w:val="14"/>
+                <w:sz w:val="16"/>
+                <w:szCs w:val="16"/>
               </w:rPr>
               <w:t>({total_items})</w:t>
             </w:r>
@@ -551,16 +551,16 @@
             <w:pPr>
               <w:jc w:val="right"/>
               <w:rPr>
-                <w:sz w:val="14"/>
-                <w:szCs w:val="14"/>
+                <w:sz w:val="16"/>
+                <w:szCs w:val="16"/>
               </w:rPr>
             </w:pPr>
             <w:r>
               <w:rPr>
                 <w:b/>
                 <w:bCs/>
-                <w:sz w:val="14"/>
-                <w:szCs w:val="14"/>
+                <w:sz w:val="16"/>
+                <w:szCs w:val="16"/>
               </w:rPr>
               <w:t xml:space="preserve"> {final_total}</w:t>
             </w:r>
@@ -652,15 +652,6 @@
                 <w:szCs w:val="14"/>
               </w:rPr>
             </w:pPr>
-            <w:r>
-              <w:rPr>
-                <w:b/>
-                <w:bCs/>
-                <w:sz w:val="14"/>
-                <w:szCs w:val="14"/>
-              </w:rPr>
-              <w:t>Chuyển khoản</w:t>
-            </w:r>
           </w:p>
         </w:tc>
         <w:tc>
@@ -677,15 +668,6 @@
                 <w:szCs w:val="14"/>
               </w:rPr>
             </w:pPr>
-            <w:r>
-              <w:rPr>
-                <w:b/>
-                <w:bCs/>
-                <w:sz w:val="14"/>
-                <w:szCs w:val="14"/>
-              </w:rPr>
-              <w:t>{final_total}</w:t>
-            </w:r>
           </w:p>
         </w:tc>
       </w:tr>

</xml_diff>